<commit_message>
Realizado as atividade da semana 2, e avanço no mini projeto.
</commit_message>
<xml_diff>
--- a/plano-de-estudo/BACK-END_JAVASCRIPT_QUESTIONARIO-FASE1_SEMANA1.docx
+++ b/plano-de-estudo/BACK-END_JAVASCRIPT_QUESTIONARIO-FASE1_SEMANA1.docx
@@ -765,24 +765,31 @@
         <w:spacing w:before="285" w:after="285"/>
         <w:jc w:val="center"/>
         <w:rPr>
+          <w:sz w:val="18"/>
+          <w:szCs w:val="18"/>
+        </w:rPr>
+      </w:pPr>
+      <w:r>
+        <w:rPr>
           <w:rFonts w:ascii="Segoe UI Black" w:hAnsi="Segoe UI Black"/>
           <w:b w:val="false"/>
           <w:bCs w:val="false"/>
           <w:color w:val="333333"/>
-          <w:sz w:val="20"/>
-          <w:szCs w:val="20"/>
-        </w:rPr>
-      </w:pPr>
+          <w:sz w:val="18"/>
+          <w:szCs w:val="18"/>
+        </w:rPr>
+        <w:t>🧠</w:t>
+      </w:r>
       <w:r>
         <w:rPr>
           <w:rFonts w:ascii="Segoe UI Black" w:hAnsi="Segoe UI Black"/>
           <w:b w:val="false"/>
           <w:bCs w:val="false"/>
-          <w:color w:val="333333"/>
-          <w:sz w:val="20"/>
-          <w:szCs w:val="20"/>
-        </w:rPr>
-        <w:t>🧠</w:t>
+          <w:color w:val="666666"/>
+          <w:sz w:val="18"/>
+          <w:szCs w:val="18"/>
+        </w:rPr>
+        <w:t xml:space="preserve"> </w:t>
       </w:r>
       <w:r>
         <w:rPr>
@@ -790,19 +797,8 @@
           <w:b w:val="false"/>
           <w:bCs w:val="false"/>
           <w:color w:val="666666"/>
-          <w:sz w:val="20"/>
-          <w:szCs w:val="20"/>
-        </w:rPr>
-        <w:t xml:space="preserve"> </w:t>
-      </w:r>
-      <w:r>
-        <w:rPr>
-          <w:rFonts w:ascii="Segoe UI Black" w:hAnsi="Segoe UI Black"/>
-          <w:b w:val="false"/>
-          <w:bCs w:val="false"/>
-          <w:color w:val="666666"/>
-          <w:sz w:val="20"/>
-          <w:szCs w:val="20"/>
+          <w:sz w:val="18"/>
+          <w:szCs w:val="18"/>
         </w:rPr>
         <w:t>Questões Teóricas</w:t>
       </w:r>
@@ -866,16 +862,7 @@
           <w:sz w:val="18"/>
           <w:szCs w:val="18"/>
         </w:rPr>
-        <w:t xml:space="preserve">Resposta: </w:t>
-      </w:r>
-      <w:r>
-        <w:rPr>
-          <w:rFonts w:ascii="Segoe UI Semibold" w:hAnsi="Segoe UI Semibold"/>
-          <w:color w:val="333333"/>
-          <w:sz w:val="18"/>
-          <w:szCs w:val="18"/>
-        </w:rPr>
-        <w:t>JavaScript é uma linguagem de programação interpretada criada para ser rodada do lado do cliente. Despois espandida para utilização no lado do servidor com o auxilio do Node.js.</w:t>
+        <w:t>Resposta: JavaScript é uma linguagem de programação interpretada criada para ser rodada do lado do cliente. Despois espandida para utilização no lado do servidor com o auxilio do Node.js.</w:t>
       </w:r>
     </w:p>
     <w:p>
@@ -988,25 +975,7 @@
           <w:sz w:val="18"/>
           <w:szCs w:val="18"/>
         </w:rPr>
-        <w:t>c</w:t>
-      </w:r>
-      <w:r>
-        <w:rPr>
-          <w:rFonts w:ascii="Segoe UI Semibold" w:hAnsi="Segoe UI Semibold"/>
-          <w:color w:val="333333"/>
-          <w:sz w:val="18"/>
-          <w:szCs w:val="18"/>
-        </w:rPr>
-        <w:t xml:space="preserve">) Navegador e servidor. </w:t>
-      </w:r>
-      <w:r>
-        <w:rPr>
-          <w:rFonts w:ascii="Segoe UI Semibold" w:hAnsi="Segoe UI Semibold"/>
-          <w:color w:val="333333"/>
-          <w:sz w:val="18"/>
-          <w:szCs w:val="18"/>
-        </w:rPr>
-        <w:t>( x )</w:t>
+        <w:t>c) Navegador e servidor. ( x )</w:t>
       </w:r>
     </w:p>
     <w:p>
@@ -1179,52 +1148,7 @@
           <w:sz w:val="18"/>
           <w:szCs w:val="18"/>
         </w:rPr>
-        <w:t xml:space="preserve">Resposta: </w:t>
-      </w:r>
-      <w:r>
-        <w:rPr>
-          <w:rFonts w:ascii="Segoe UI Semibold" w:hAnsi="Segoe UI Semibold"/>
-          <w:color w:val="333333"/>
-          <w:sz w:val="18"/>
-          <w:szCs w:val="18"/>
-        </w:rPr>
-        <w:t>let e var são formas de declarar variáveis, sendo let uma uma versão mais morderna e melhorada de var, onde as variáveis declaradas com var são içadas, o que permitia referenciar uma váriaveis  antes mesmo dela ser declarada, isso poderia ca</w:t>
-      </w:r>
-      <w:r>
-        <w:rPr>
-          <w:rFonts w:ascii="Segoe UI Semibold" w:hAnsi="Segoe UI Semibold"/>
-          <w:color w:val="333333"/>
-          <w:sz w:val="18"/>
-          <w:szCs w:val="18"/>
-        </w:rPr>
-        <w:t>us</w:t>
-      </w:r>
-      <w:r>
-        <w:rPr>
-          <w:rFonts w:ascii="Segoe UI Semibold" w:hAnsi="Segoe UI Semibold"/>
-          <w:color w:val="333333"/>
-          <w:sz w:val="18"/>
-          <w:szCs w:val="18"/>
-        </w:rPr>
-        <w:t xml:space="preserve">ar </w:t>
-      </w:r>
-      <w:r>
-        <w:rPr>
-          <w:rFonts w:ascii="Segoe UI Semibold" w:hAnsi="Segoe UI Semibold"/>
-          <w:color w:val="333333"/>
-          <w:sz w:val="18"/>
-          <w:szCs w:val="18"/>
-        </w:rPr>
-        <w:t xml:space="preserve">um </w:t>
-      </w:r>
-      <w:r>
-        <w:rPr>
-          <w:rFonts w:ascii="Segoe UI Semibold" w:hAnsi="Segoe UI Semibold"/>
-          <w:color w:val="333333"/>
-          <w:sz w:val="18"/>
-          <w:szCs w:val="18"/>
-        </w:rPr>
-        <w:t>resultados inesperados causando falhas silenciosas, por isso a função de içamento foi corrigido com let, var caiu em desuso sendo let recomendado na criação que qualquer váriavel. const é utilizado na declaração de constante, constante é uma váriavel, onde não pode receber uma nova atrbuição de valor após ser declarada, sendo essa a difirença de const para let e var.</w:t>
+        <w:t>Resposta: let e var são formas de declarar variáveis, sendo let uma uma versão mais morderna e melhorada de var, onde as variáveis declaradas com var são içadas, o que permitia referenciar uma váriaveis  antes mesmo dela ser declarada, isso poderia causar um resultados inesperados causando falhas silenciosas, por isso a função de içamento foi corrigido com let, var caiu em desuso sendo let recomendado na criação que qualquer váriavel. const é utilizado na declaração de constante, constante é uma váriavel, onde não pode receber uma nova atrbuição de valor após ser declarada, sendo essa a difirença de const para let e var.</w:t>
       </w:r>
     </w:p>
     <w:p>
@@ -1295,16 +1219,7 @@
           <w:sz w:val="18"/>
           <w:szCs w:val="18"/>
         </w:rPr>
-        <w:t xml:space="preserve">Resposta: </w:t>
-      </w:r>
-      <w:r>
-        <w:rPr>
-          <w:rFonts w:ascii="Segoe UI Semibold" w:hAnsi="Segoe UI Semibold"/>
-          <w:color w:val="333333"/>
-          <w:sz w:val="18"/>
-          <w:szCs w:val="18"/>
-        </w:rPr>
-        <w:t>Significa que suas variáveis podem receber tipos de valores diferentes a cada atribuição.</w:t>
+        <w:t>Resposta: Significa que suas variáveis podem receber tipos de valores diferentes a cada atribuição.</w:t>
       </w:r>
     </w:p>
     <w:p>
@@ -1353,16 +1268,7 @@
           <w:sz w:val="18"/>
           <w:szCs w:val="18"/>
         </w:rPr>
-        <w:t xml:space="preserve">Resposta: </w:t>
-      </w:r>
-      <w:r>
-        <w:rPr>
-          <w:rFonts w:ascii="Segoe UI Semibold" w:hAnsi="Segoe UI Semibold"/>
-          <w:color w:val="333333"/>
-          <w:sz w:val="18"/>
-          <w:szCs w:val="18"/>
-        </w:rPr>
-        <w:t>string, number, boolean, undefined e null.</w:t>
+        <w:t>Resposta: string, number, boolean, undefined e null.</w:t>
       </w:r>
     </w:p>
     <w:p>
@@ -1448,16 +1354,7 @@
           <w:sz w:val="18"/>
           <w:szCs w:val="18"/>
         </w:rPr>
-        <w:t xml:space="preserve">Resposta: </w:t>
-      </w:r>
-      <w:r>
-        <w:rPr>
-          <w:rFonts w:ascii="Segoe UI Semibold" w:hAnsi="Segoe UI Semibold"/>
-          <w:color w:val="333333"/>
-          <w:sz w:val="18"/>
-          <w:szCs w:val="18"/>
-        </w:rPr>
-        <w:t>Indicar o tipo de um valor.</w:t>
+        <w:t>Resposta: Indicar o tipo de um valor.</w:t>
       </w:r>
     </w:p>
     <w:p>
@@ -1574,8 +1471,65 @@
           <w:sz w:val="18"/>
           <w:szCs w:val="18"/>
         </w:rPr>
-        <w:t xml:space="preserve">Resposta: </w:t>
-      </w:r>
+        <w:t xml:space="preserve">Resposta: Ambos realizam comparações, mas “==” realiza a conversão de tipo antes de realizar a comparação dos valores, entando “===” realiza a comparação do valor e tipo. </w:t>
+      </w:r>
+    </w:p>
+    <w:p>
+      <w:pPr>
+        <w:pStyle w:val="BodyText"/>
+        <w:bidi w:val="0"/>
+        <w:spacing w:lineRule="auto" w:line="240" w:before="0" w:after="0"/>
+        <w:jc w:val="start"/>
+        <w:rPr>
+          <w:rFonts w:ascii="Segoe UI Semibold" w:hAnsi="Segoe UI Semibold"/>
+          <w:sz w:val="18"/>
+          <w:szCs w:val="18"/>
+        </w:rPr>
+      </w:pPr>
+      <w:r>
+        <w:rPr>
+          <w:rFonts w:ascii="Segoe UI Semibold" w:hAnsi="Segoe UI Semibold"/>
+          <w:sz w:val="18"/>
+          <w:szCs w:val="18"/>
+        </w:rPr>
+      </w:r>
+    </w:p>
+    <w:p>
+      <w:pPr>
+        <w:pStyle w:val="BodyText"/>
+        <w:bidi w:val="0"/>
+        <w:spacing w:lineRule="auto" w:line="240" w:before="0" w:after="0"/>
+        <w:jc w:val="start"/>
+        <w:rPr/>
+      </w:pPr>
+      <w:r>
+        <w:rPr>
+          <w:rStyle w:val="Strong"/>
+          <w:rFonts w:ascii="Segoe UI Black" w:hAnsi="Segoe UI Black"/>
+          <w:color w:val="666666"/>
+          <w:sz w:val="18"/>
+          <w:szCs w:val="18"/>
+        </w:rPr>
+        <w:t>8.</w:t>
+      </w:r>
+      <w:r>
+        <w:rPr>
+          <w:rFonts w:ascii="Segoe UI Black" w:hAnsi="Segoe UI Black"/>
+          <w:color w:val="666666"/>
+          <w:sz w:val="18"/>
+          <w:szCs w:val="18"/>
+        </w:rPr>
+        <w:t xml:space="preserve"> O que é coerção de tipos?</w:t>
+      </w:r>
+    </w:p>
+    <w:p>
+      <w:pPr>
+        <w:pStyle w:val="BodyText"/>
+        <w:bidi w:val="0"/>
+        <w:spacing w:lineRule="auto" w:line="240" w:before="0" w:after="0"/>
+        <w:jc w:val="start"/>
+        <w:rPr/>
+      </w:pPr>
       <w:r>
         <w:rPr>
           <w:rStyle w:val="Cdigo-fonte"/>
@@ -1584,7 +1538,7 @@
           <w:sz w:val="18"/>
           <w:szCs w:val="18"/>
         </w:rPr>
-        <w:t xml:space="preserve">Ambos realizam comparações, mas “==” realiza a conversão de tipo antes de realizar a comparação dos valores, entando “===” realiza a comparação do valor e tipo. </w:t>
+        <w:t>Resposta: É a conversão de automática de tipo que ocorre quando um operador recebe um valor de tipo não esperado.</w:t>
       </w:r>
     </w:p>
     <w:p>
@@ -1623,16 +1577,35 @@
           <w:sz w:val="18"/>
           <w:szCs w:val="18"/>
         </w:rPr>
-        <w:t>8.</w:t>
-      </w:r>
-      <w:r>
-        <w:rPr>
-          <w:rFonts w:ascii="Segoe UI Black" w:hAnsi="Segoe UI Black"/>
-          <w:color w:val="666666"/>
-          <w:sz w:val="18"/>
-          <w:szCs w:val="18"/>
-        </w:rPr>
-        <w:t xml:space="preserve"> O que é coerção de tipos?</w:t>
+        <w:t>9.</w:t>
+      </w:r>
+      <w:r>
+        <w:rPr>
+          <w:rFonts w:ascii="Segoe UI Black" w:hAnsi="Segoe UI Black"/>
+          <w:color w:val="666666"/>
+          <w:sz w:val="18"/>
+          <w:szCs w:val="18"/>
+        </w:rPr>
+        <w:t xml:space="preserve"> O que significa o valor </w:t>
+      </w:r>
+      <w:r>
+        <w:rPr>
+          <w:rStyle w:val="Cdigo-fonte"/>
+          <w:rFonts w:ascii="Segoe UI Black" w:hAnsi="Segoe UI Black"/>
+          <w:color w:val="666666"/>
+          <w:sz w:val="18"/>
+          <w:szCs w:val="18"/>
+        </w:rPr>
+        <w:t>NaN</w:t>
+      </w:r>
+      <w:r>
+        <w:rPr>
+          <w:rFonts w:ascii="Segoe UI Black" w:hAnsi="Segoe UI Black"/>
+          <w:color w:val="666666"/>
+          <w:sz w:val="18"/>
+          <w:szCs w:val="18"/>
+        </w:rPr>
+        <w:t>?</w:t>
       </w:r>
     </w:p>
     <w:p>
@@ -1651,8 +1624,65 @@
           <w:sz w:val="18"/>
           <w:szCs w:val="18"/>
         </w:rPr>
-        <w:t xml:space="preserve">Resposta: </w:t>
-      </w:r>
+        <w:t>Resposta: “Not a Number”, apesar ser do tipo number, NaN é retornado quando uma operador matemático recebe um valor que não pode ser convertido para o tipo number.</w:t>
+      </w:r>
+    </w:p>
+    <w:p>
+      <w:pPr>
+        <w:pStyle w:val="BodyText"/>
+        <w:bidi w:val="0"/>
+        <w:spacing w:lineRule="auto" w:line="240" w:before="0" w:after="0"/>
+        <w:jc w:val="start"/>
+        <w:rPr>
+          <w:rFonts w:ascii="Segoe UI Semibold" w:hAnsi="Segoe UI Semibold"/>
+          <w:sz w:val="18"/>
+          <w:szCs w:val="18"/>
+        </w:rPr>
+      </w:pPr>
+      <w:r>
+        <w:rPr>
+          <w:rFonts w:ascii="Segoe UI Semibold" w:hAnsi="Segoe UI Semibold"/>
+          <w:sz w:val="18"/>
+          <w:szCs w:val="18"/>
+        </w:rPr>
+      </w:r>
+    </w:p>
+    <w:p>
+      <w:pPr>
+        <w:pStyle w:val="BodyText"/>
+        <w:bidi w:val="0"/>
+        <w:spacing w:lineRule="auto" w:line="240" w:before="0" w:after="0"/>
+        <w:jc w:val="start"/>
+        <w:rPr/>
+      </w:pPr>
+      <w:r>
+        <w:rPr>
+          <w:rStyle w:val="Strong"/>
+          <w:rFonts w:ascii="Segoe UI Black" w:hAnsi="Segoe UI Black"/>
+          <w:color w:val="666666"/>
+          <w:sz w:val="18"/>
+          <w:szCs w:val="18"/>
+        </w:rPr>
+        <w:t>10.</w:t>
+      </w:r>
+      <w:r>
+        <w:rPr>
+          <w:rFonts w:ascii="Segoe UI Black" w:hAnsi="Segoe UI Black"/>
+          <w:color w:val="666666"/>
+          <w:sz w:val="18"/>
+          <w:szCs w:val="18"/>
+        </w:rPr>
+        <w:t xml:space="preserve"> Qual é a vantagem de utilizar Template Strings?</w:t>
+      </w:r>
+    </w:p>
+    <w:p>
+      <w:pPr>
+        <w:pStyle w:val="BodyText"/>
+        <w:bidi w:val="0"/>
+        <w:spacing w:lineRule="auto" w:line="240" w:before="0" w:after="0"/>
+        <w:jc w:val="start"/>
+        <w:rPr/>
+      </w:pPr>
       <w:r>
         <w:rPr>
           <w:rStyle w:val="Cdigo-fonte"/>
@@ -1661,85 +1691,38 @@
           <w:sz w:val="18"/>
           <w:szCs w:val="18"/>
         </w:rPr>
-        <w:t>É a conversão de automática de tipo que ocorre quando um operador recebe um valor de tipo não esperado.</w:t>
-      </w:r>
-    </w:p>
-    <w:p>
-      <w:pPr>
-        <w:pStyle w:val="BodyText"/>
-        <w:bidi w:val="0"/>
-        <w:spacing w:lineRule="auto" w:line="240" w:before="0" w:after="0"/>
-        <w:jc w:val="start"/>
-        <w:rPr>
-          <w:rFonts w:ascii="Segoe UI Semibold" w:hAnsi="Segoe UI Semibold"/>
-          <w:sz w:val="18"/>
-          <w:szCs w:val="18"/>
-        </w:rPr>
-      </w:pPr>
-      <w:r>
-        <w:rPr>
-          <w:rFonts w:ascii="Segoe UI Semibold" w:hAnsi="Segoe UI Semibold"/>
-          <w:sz w:val="18"/>
-          <w:szCs w:val="18"/>
-        </w:rPr>
-      </w:r>
-    </w:p>
-    <w:p>
-      <w:pPr>
-        <w:pStyle w:val="BodyText"/>
-        <w:bidi w:val="0"/>
-        <w:spacing w:lineRule="auto" w:line="240" w:before="0" w:after="0"/>
-        <w:jc w:val="start"/>
-        <w:rPr/>
-      </w:pPr>
-      <w:r>
-        <w:rPr>
-          <w:rStyle w:val="Strong"/>
-          <w:rFonts w:ascii="Segoe UI Black" w:hAnsi="Segoe UI Black"/>
-          <w:color w:val="666666"/>
-          <w:sz w:val="18"/>
-          <w:szCs w:val="18"/>
-        </w:rPr>
-        <w:t>9.</w:t>
-      </w:r>
-      <w:r>
-        <w:rPr>
-          <w:rFonts w:ascii="Segoe UI Black" w:hAnsi="Segoe UI Black"/>
-          <w:color w:val="666666"/>
-          <w:sz w:val="18"/>
-          <w:szCs w:val="18"/>
-        </w:rPr>
-        <w:t xml:space="preserve"> O que significa o valor </w:t>
-      </w:r>
-      <w:r>
+        <w:t>Resposta: Facilita a ultilização de valores váriaveis dentro de uma string, ao invés de  utilizar vários operados de concatenação.</w:t>
+      </w:r>
+    </w:p>
+    <w:p>
+      <w:pPr>
+        <w:pStyle w:val="BodyText"/>
+        <w:bidi w:val="0"/>
+        <w:spacing w:lineRule="auto" w:line="240" w:before="0" w:after="0"/>
+        <w:jc w:val="start"/>
         <w:rPr>
           <w:rStyle w:val="Cdigo-fonte"/>
-          <w:rFonts w:ascii="Segoe UI Black" w:hAnsi="Segoe UI Black"/>
-          <w:color w:val="666666"/>
-          <w:sz w:val="18"/>
-          <w:szCs w:val="18"/>
-        </w:rPr>
-        <w:t>NaN</w:t>
-      </w:r>
-      <w:r>
-        <w:rPr>
-          <w:rFonts w:ascii="Segoe UI Black" w:hAnsi="Segoe UI Black"/>
-          <w:color w:val="666666"/>
-          <w:sz w:val="18"/>
-          <w:szCs w:val="18"/>
-        </w:rPr>
-        <w:t>?</w:t>
-      </w:r>
-    </w:p>
-    <w:p>
-      <w:pPr>
-        <w:pStyle w:val="BodyText"/>
-        <w:bidi w:val="0"/>
-        <w:spacing w:lineRule="auto" w:line="240" w:before="0" w:after="0"/>
-        <w:jc w:val="start"/>
-        <w:rPr/>
-      </w:pPr>
-      <w:r>
+          <w:rFonts w:ascii="Segoe UI Semibold" w:hAnsi="Segoe UI Semibold"/>
+          <w:color w:val="333333"/>
+          <w:sz w:val="18"/>
+          <w:szCs w:val="18"/>
+        </w:rPr>
+      </w:pPr>
+      <w:r>
+        <w:rPr>
+          <w:rFonts w:ascii="Segoe UI Semibold" w:hAnsi="Segoe UI Semibold"/>
+          <w:color w:val="333333"/>
+          <w:sz w:val="18"/>
+          <w:szCs w:val="18"/>
+        </w:rPr>
+      </w:r>
+    </w:p>
+    <w:p>
+      <w:pPr>
+        <w:pStyle w:val="BodyText"/>
+        <w:bidi w:val="0"/>
+        <w:spacing w:lineRule="auto" w:line="240" w:before="0" w:after="0"/>
+        <w:jc w:val="start"/>
         <w:rPr>
           <w:rStyle w:val="Cdigo-fonte"/>
           <w:rFonts w:ascii="Segoe UI Semibold" w:hAnsi="Segoe UI Semibold"/>
@@ -1747,9 +1730,22 @@
           <w:sz w:val="18"/>
           <w:szCs w:val="18"/>
         </w:rPr>
-        <w:t>Resposta: “</w:t>
-      </w:r>
-      <w:r>
+      </w:pPr>
+      <w:r>
+        <w:rPr>
+          <w:rFonts w:ascii="Segoe UI Semibold" w:hAnsi="Segoe UI Semibold"/>
+          <w:color w:val="333333"/>
+          <w:sz w:val="18"/>
+          <w:szCs w:val="18"/>
+        </w:rPr>
+      </w:r>
+    </w:p>
+    <w:p>
+      <w:pPr>
+        <w:pStyle w:val="BodyText"/>
+        <w:bidi w:val="0"/>
+        <w:spacing w:lineRule="auto" w:line="240" w:before="0" w:after="0"/>
+        <w:jc w:val="start"/>
         <w:rPr>
           <w:rStyle w:val="Cdigo-fonte"/>
           <w:rFonts w:ascii="Segoe UI Semibold" w:hAnsi="Segoe UI Semibold"/>
@@ -1757,9 +1753,22 @@
           <w:sz w:val="18"/>
           <w:szCs w:val="18"/>
         </w:rPr>
-        <w:t xml:space="preserve">Not a Number”, apesar ser do tipo number, </w:t>
-      </w:r>
-      <w:r>
+      </w:pPr>
+      <w:r>
+        <w:rPr>
+          <w:rFonts w:ascii="Segoe UI Semibold" w:hAnsi="Segoe UI Semibold"/>
+          <w:color w:val="333333"/>
+          <w:sz w:val="18"/>
+          <w:szCs w:val="18"/>
+        </w:rPr>
+      </w:r>
+    </w:p>
+    <w:p>
+      <w:pPr>
+        <w:pStyle w:val="BodyText"/>
+        <w:bidi w:val="0"/>
+        <w:spacing w:lineRule="auto" w:line="240" w:before="0" w:after="0"/>
+        <w:jc w:val="start"/>
         <w:rPr>
           <w:rStyle w:val="Cdigo-fonte"/>
           <w:rFonts w:ascii="Segoe UI Semibold" w:hAnsi="Segoe UI Semibold"/>
@@ -1767,9 +1776,22 @@
           <w:sz w:val="18"/>
           <w:szCs w:val="18"/>
         </w:rPr>
-        <w:t xml:space="preserve">NaN é retornado quando uma operador </w:t>
-      </w:r>
-      <w:r>
+      </w:pPr>
+      <w:r>
+        <w:rPr>
+          <w:rFonts w:ascii="Segoe UI Semibold" w:hAnsi="Segoe UI Semibold"/>
+          <w:color w:val="333333"/>
+          <w:sz w:val="18"/>
+          <w:szCs w:val="18"/>
+        </w:rPr>
+      </w:r>
+    </w:p>
+    <w:p>
+      <w:pPr>
+        <w:pStyle w:val="BodyText"/>
+        <w:bidi w:val="0"/>
+        <w:spacing w:lineRule="auto" w:line="240" w:before="0" w:after="0"/>
+        <w:jc w:val="start"/>
         <w:rPr>
           <w:rStyle w:val="Cdigo-fonte"/>
           <w:rFonts w:ascii="Segoe UI Semibold" w:hAnsi="Segoe UI Semibold"/>
@@ -1777,204 +1799,14 @@
           <w:sz w:val="18"/>
           <w:szCs w:val="18"/>
         </w:rPr>
-        <w:t>matemático</w:t>
-      </w:r>
-      <w:r>
-        <w:rPr>
-          <w:rStyle w:val="Cdigo-fonte"/>
-          <w:rFonts w:ascii="Segoe UI Semibold" w:hAnsi="Segoe UI Semibold"/>
-          <w:color w:val="333333"/>
-          <w:sz w:val="18"/>
-          <w:szCs w:val="18"/>
-        </w:rPr>
-        <w:t xml:space="preserve"> </w:t>
-      </w:r>
-      <w:r>
-        <w:rPr>
-          <w:rStyle w:val="Cdigo-fonte"/>
-          <w:rFonts w:ascii="Segoe UI Semibold" w:hAnsi="Segoe UI Semibold"/>
-          <w:color w:val="333333"/>
-          <w:sz w:val="18"/>
-          <w:szCs w:val="18"/>
-        </w:rPr>
-        <w:t>recebe um valor que não</w:t>
-      </w:r>
-      <w:r>
-        <w:rPr>
-          <w:rStyle w:val="Cdigo-fonte"/>
-          <w:rFonts w:ascii="Segoe UI Semibold" w:hAnsi="Segoe UI Semibold"/>
-          <w:color w:val="333333"/>
-          <w:sz w:val="18"/>
-          <w:szCs w:val="18"/>
-        </w:rPr>
-        <w:t xml:space="preserve"> pode ser convertido para o tipo number.</w:t>
-      </w:r>
-    </w:p>
-    <w:p>
-      <w:pPr>
-        <w:pStyle w:val="BodyText"/>
-        <w:bidi w:val="0"/>
-        <w:spacing w:lineRule="auto" w:line="240" w:before="0" w:after="0"/>
-        <w:jc w:val="start"/>
-        <w:rPr>
-          <w:rFonts w:ascii="Segoe UI Semibold" w:hAnsi="Segoe UI Semibold"/>
-          <w:sz w:val="18"/>
-          <w:szCs w:val="18"/>
-        </w:rPr>
-      </w:pPr>
-      <w:r>
-        <w:rPr>
-          <w:rFonts w:ascii="Segoe UI Semibold" w:hAnsi="Segoe UI Semibold"/>
-          <w:sz w:val="18"/>
-          <w:szCs w:val="18"/>
-        </w:rPr>
-      </w:r>
-    </w:p>
-    <w:p>
-      <w:pPr>
-        <w:pStyle w:val="BodyText"/>
-        <w:bidi w:val="0"/>
-        <w:spacing w:lineRule="auto" w:line="240" w:before="0" w:after="0"/>
-        <w:jc w:val="start"/>
-        <w:rPr/>
-      </w:pPr>
-      <w:r>
-        <w:rPr>
-          <w:rStyle w:val="Strong"/>
-          <w:rFonts w:ascii="Segoe UI Black" w:hAnsi="Segoe UI Black"/>
-          <w:color w:val="666666"/>
-          <w:sz w:val="18"/>
-          <w:szCs w:val="18"/>
-        </w:rPr>
-        <w:t>10.</w:t>
-      </w:r>
-      <w:r>
-        <w:rPr>
-          <w:rFonts w:ascii="Segoe UI Black" w:hAnsi="Segoe UI Black"/>
-          <w:color w:val="666666"/>
-          <w:sz w:val="18"/>
-          <w:szCs w:val="18"/>
-        </w:rPr>
-        <w:t xml:space="preserve"> Qual é a vantagem de utilizar Template Strings?</w:t>
-      </w:r>
-    </w:p>
-    <w:p>
-      <w:pPr>
-        <w:pStyle w:val="BodyText"/>
-        <w:bidi w:val="0"/>
-        <w:spacing w:lineRule="auto" w:line="240" w:before="0" w:after="0"/>
-        <w:jc w:val="start"/>
-        <w:rPr/>
-      </w:pPr>
-      <w:r>
-        <w:rPr>
-          <w:rStyle w:val="Cdigo-fonte"/>
-          <w:rFonts w:ascii="Segoe UI Semibold" w:hAnsi="Segoe UI Semibold"/>
-          <w:color w:val="333333"/>
-          <w:sz w:val="18"/>
-          <w:szCs w:val="18"/>
-        </w:rPr>
-        <w:t xml:space="preserve">Resposta: </w:t>
-      </w:r>
-      <w:r>
-        <w:rPr>
-          <w:rStyle w:val="Cdigo-fonte"/>
-          <w:rFonts w:ascii="Segoe UI Semibold" w:hAnsi="Segoe UI Semibold"/>
-          <w:color w:val="333333"/>
-          <w:sz w:val="18"/>
-          <w:szCs w:val="18"/>
-        </w:rPr>
-        <w:t>Facilita a ultilização de valores váriaveis dentro de uma string, ao invés de  utilizar vários operados de concatenação.</w:t>
-      </w:r>
-    </w:p>
-    <w:p>
-      <w:pPr>
-        <w:pStyle w:val="BodyText"/>
-        <w:bidi w:val="0"/>
-        <w:spacing w:lineRule="auto" w:line="240" w:before="0" w:after="0"/>
-        <w:jc w:val="start"/>
-        <w:rPr>
-          <w:rStyle w:val="Cdigo-fonte"/>
-          <w:rFonts w:ascii="Segoe UI Semibold" w:hAnsi="Segoe UI Semibold"/>
-          <w:color w:val="333333"/>
-          <w:sz w:val="18"/>
-          <w:szCs w:val="18"/>
-        </w:rPr>
-      </w:pPr>
-      <w:r>
-        <w:rPr/>
-      </w:r>
-    </w:p>
-    <w:p>
-      <w:pPr>
-        <w:pStyle w:val="BodyText"/>
-        <w:bidi w:val="0"/>
-        <w:spacing w:lineRule="auto" w:line="240" w:before="0" w:after="0"/>
-        <w:jc w:val="start"/>
-        <w:rPr>
-          <w:rStyle w:val="Cdigo-fonte"/>
-          <w:rFonts w:ascii="Segoe UI Semibold" w:hAnsi="Segoe UI Semibold"/>
-          <w:color w:val="333333"/>
-          <w:sz w:val="18"/>
-          <w:szCs w:val="18"/>
-        </w:rPr>
-      </w:pPr>
-      <w:r>
-        <w:rPr/>
-      </w:r>
-    </w:p>
-    <w:p>
-      <w:pPr>
-        <w:pStyle w:val="BodyText"/>
-        <w:bidi w:val="0"/>
-        <w:spacing w:lineRule="auto" w:line="240" w:before="0" w:after="0"/>
-        <w:jc w:val="start"/>
-        <w:rPr>
-          <w:rStyle w:val="Cdigo-fonte"/>
-          <w:rFonts w:ascii="Segoe UI Semibold" w:hAnsi="Segoe UI Semibold"/>
-          <w:color w:val="333333"/>
-          <w:sz w:val="18"/>
-          <w:szCs w:val="18"/>
-        </w:rPr>
-      </w:pPr>
-      <w:r>
-        <w:rPr/>
-      </w:r>
-    </w:p>
-    <w:p>
-      <w:pPr>
-        <w:pStyle w:val="BodyText"/>
-        <w:bidi w:val="0"/>
-        <w:spacing w:lineRule="auto" w:line="240" w:before="0" w:after="0"/>
-        <w:jc w:val="start"/>
-        <w:rPr>
-          <w:rStyle w:val="Cdigo-fonte"/>
-          <w:rFonts w:ascii="Segoe UI Semibold" w:hAnsi="Segoe UI Semibold"/>
-          <w:color w:val="333333"/>
-          <w:sz w:val="18"/>
-          <w:szCs w:val="18"/>
-        </w:rPr>
-      </w:pPr>
-      <w:r>
-        <w:rPr/>
-      </w:r>
-    </w:p>
-    <w:p>
-      <w:pPr>
-        <w:pStyle w:val="BodyText"/>
-        <w:bidi w:val="0"/>
-        <w:spacing w:lineRule="auto" w:line="240" w:before="0" w:after="0"/>
-        <w:jc w:val="start"/>
-        <w:rPr>
-          <w:rStyle w:val="Cdigo-fonte"/>
-          <w:rFonts w:ascii="Segoe UI Semibold" w:hAnsi="Segoe UI Semibold"/>
-          <w:color w:val="333333"/>
-          <w:sz w:val="18"/>
-          <w:szCs w:val="18"/>
-        </w:rPr>
-      </w:pPr>
-      <w:r>
-        <w:rPr/>
+      </w:pPr>
+      <w:r>
+        <w:rPr>
+          <w:rFonts w:ascii="Segoe UI Semibold" w:hAnsi="Segoe UI Semibold"/>
+          <w:color w:val="333333"/>
+          <w:sz w:val="18"/>
+          <w:szCs w:val="18"/>
+        </w:rPr>
       </w:r>
     </w:p>
     <w:p>
@@ -2005,8 +1837,29 @@
         <w:rPr>
           <w:rFonts w:ascii="Segoe UI Black" w:hAnsi="Segoe UI Black"/>
           <w:color w:val="666666"/>
-          <w:sz w:val="20"/>
-          <w:szCs w:val="20"/>
+        </w:rPr>
+      </w:r>
+    </w:p>
+    <w:p>
+      <w:pPr>
+        <w:pStyle w:val="Heading1"/>
+        <w:bidi w:val="0"/>
+        <w:spacing w:before="0" w:after="285"/>
+        <w:jc w:val="center"/>
+        <w:rPr>
+          <w:sz w:val="18"/>
+          <w:szCs w:val="18"/>
+        </w:rPr>
+      </w:pPr>
+      <w:r>
+        <w:br w:type="column"/>
+      </w:r>
+      <w:r>
+        <w:rPr>
+          <w:rFonts w:ascii="Segoe UI Black" w:hAnsi="Segoe UI Black"/>
+          <w:color w:val="666666"/>
+          <w:sz w:val="18"/>
+          <w:szCs w:val="18"/>
         </w:rPr>
         <w:t xml:space="preserve">💻 </w:t>
       </w:r>
@@ -2014,8 +1867,8 @@
         <w:rPr>
           <w:rFonts w:ascii="Segoe UI Black" w:hAnsi="Segoe UI Black"/>
           <w:color w:val="666666"/>
-          <w:sz w:val="20"/>
-          <w:szCs w:val="20"/>
+          <w:sz w:val="18"/>
+          <w:szCs w:val="18"/>
         </w:rPr>
         <w:t>Interpretação de Código</w:t>
       </w:r>
@@ -2122,19 +1975,7 @@
           <w:sz w:val="18"/>
           <w:szCs w:val="18"/>
         </w:rPr>
-        <w:t xml:space="preserve">Resposta: </w:t>
-      </w:r>
-      <w:r>
-        <w:rPr>
-          <w:rStyle w:val="Cdigo-fonte"/>
-          <w:rFonts w:ascii="Segoe UI Semibold" w:hAnsi="Segoe UI Semibold"/>
-          <w:b/>
-          <w:bCs/>
-          <w:color w:val="333333"/>
-          <w:sz w:val="18"/>
-          <w:szCs w:val="18"/>
-        </w:rPr>
-        <w:t>string</w:t>
+        <w:t>Resposta: string</w:t>
       </w:r>
     </w:p>
     <w:p>
@@ -2360,19 +2201,7 @@
           <w:sz w:val="18"/>
           <w:szCs w:val="18"/>
         </w:rPr>
-        <w:t xml:space="preserve">Resposta: </w:t>
-      </w:r>
-      <w:r>
-        <w:rPr>
-          <w:rStyle w:val="Cdigo-fonte"/>
-          <w:rFonts w:ascii="Segoe UI Semibold" w:hAnsi="Segoe UI Semibold"/>
-          <w:b/>
-          <w:bCs/>
-          <w:color w:val="333333"/>
-          <w:sz w:val="18"/>
-          <w:szCs w:val="18"/>
-        </w:rPr>
-        <w:t>55</w:t>
+        <w:t>Resposta: 55</w:t>
       </w:r>
       <w:r>
         <w:rPr>
@@ -2478,19 +2307,7 @@
           <w:sz w:val="18"/>
           <w:szCs w:val="18"/>
         </w:rPr>
-        <w:t xml:space="preserve">Resposta: </w:t>
-      </w:r>
-      <w:r>
-        <w:rPr>
-          <w:rStyle w:val="Cdigo-fonte"/>
-          <w:rFonts w:ascii="Segoe UI Semibold" w:hAnsi="Segoe UI Semibold"/>
-          <w:b/>
-          <w:bCs/>
-          <w:color w:val="333333"/>
-          <w:sz w:val="18"/>
-          <w:szCs w:val="18"/>
-        </w:rPr>
-        <w:t>3</w:t>
+        <w:t>Resposta: 3</w:t>
       </w:r>
     </w:p>
     <w:p>
@@ -2575,31 +2392,7 @@
           <w:sz w:val="18"/>
           <w:szCs w:val="18"/>
         </w:rPr>
-        <w:t>Respos</w:t>
-      </w:r>
-      <w:r>
-        <w:rPr>
-          <w:rStyle w:val="Cdigo-fonte"/>
-          <w:rFonts w:ascii="Segoe UI Semibold" w:hAnsi="Segoe UI Semibold"/>
-          <w:b/>
-          <w:bCs/>
-          <w:color w:val="333333"/>
-          <w:sz w:val="18"/>
-          <w:szCs w:val="18"/>
-        </w:rPr>
-        <w:t xml:space="preserve">ta:  </w:t>
-      </w:r>
-      <w:r>
-        <w:rPr>
-          <w:rStyle w:val="Cdigo-fonte"/>
-          <w:rFonts w:ascii="Segoe UI Semibold" w:hAnsi="Segoe UI Semibold"/>
-          <w:b/>
-          <w:bCs/>
-          <w:color w:val="333333"/>
-          <w:sz w:val="18"/>
-          <w:szCs w:val="18"/>
-        </w:rPr>
-        <w:t>boolean</w:t>
+        <w:t>Resposta:  boolean</w:t>
       </w:r>
     </w:p>
     <w:p>
@@ -2714,19 +2507,7 @@
           <w:sz w:val="18"/>
           <w:szCs w:val="18"/>
         </w:rPr>
-        <w:t xml:space="preserve">Resposta: </w:t>
-      </w:r>
-      <w:r>
-        <w:rPr>
-          <w:rStyle w:val="Cdigo-fonte"/>
-          <w:rFonts w:ascii="Segoe UI Semibold" w:hAnsi="Segoe UI Semibold"/>
-          <w:b/>
-          <w:bCs/>
-          <w:color w:val="333333"/>
-          <w:sz w:val="18"/>
-          <w:szCs w:val="18"/>
-        </w:rPr>
-        <w:t>undefined</w:t>
+        <w:t>Resposta: undefined</w:t>
       </w:r>
     </w:p>
     <w:p>
@@ -2820,19 +2601,7 @@
           <w:sz w:val="18"/>
           <w:szCs w:val="18"/>
         </w:rPr>
-        <w:t xml:space="preserve">Resposta: </w:t>
-      </w:r>
-      <w:r>
-        <w:rPr>
-          <w:rStyle w:val="Cdigo-fonte"/>
-          <w:rFonts w:ascii="Segoe UI Semibold" w:hAnsi="Segoe UI Semibold"/>
-          <w:b/>
-          <w:bCs/>
-          <w:color w:val="333333"/>
-          <w:sz w:val="18"/>
-          <w:szCs w:val="18"/>
-        </w:rPr>
-        <w:t>object</w:t>
+        <w:t>Resposta: object</w:t>
       </w:r>
     </w:p>
     <w:p>
@@ -2926,19 +2695,7 @@
           <w:sz w:val="18"/>
           <w:szCs w:val="18"/>
         </w:rPr>
-        <w:t xml:space="preserve">Resposta:  </w:t>
-      </w:r>
-      <w:r>
-        <w:rPr>
-          <w:rStyle w:val="Cdigo-fonte"/>
-          <w:rFonts w:ascii="Segoe UI Semibold" w:hAnsi="Segoe UI Semibold"/>
-          <w:b/>
-          <w:bCs/>
-          <w:color w:val="333333"/>
-          <w:sz w:val="18"/>
-          <w:szCs w:val="18"/>
-        </w:rPr>
-        <w:t>true</w:t>
+        <w:t>Resposta:  true</w:t>
       </w:r>
     </w:p>
     <w:p>
@@ -3032,19 +2789,7 @@
           <w:sz w:val="18"/>
           <w:szCs w:val="18"/>
         </w:rPr>
-        <w:t xml:space="preserve">Resposta: </w:t>
-      </w:r>
-      <w:r>
-        <w:rPr>
-          <w:rStyle w:val="Cdigo-fonte"/>
-          <w:rFonts w:ascii="Segoe UI Semibold" w:hAnsi="Segoe UI Semibold"/>
-          <w:b/>
-          <w:bCs/>
-          <w:color w:val="333333"/>
-          <w:sz w:val="18"/>
-          <w:szCs w:val="18"/>
-        </w:rPr>
-        <w:t>false</w:t>
+        <w:t>Resposta: false</w:t>
       </w:r>
     </w:p>
     <w:p>
@@ -3159,19 +2904,7 @@
           <w:sz w:val="18"/>
           <w:szCs w:val="18"/>
         </w:rPr>
-        <w:t xml:space="preserve">Resposta: </w:t>
-      </w:r>
-      <w:r>
-        <w:rPr>
-          <w:rStyle w:val="Cdigo-fonte"/>
-          <w:rFonts w:ascii="Segoe UI Semibold" w:hAnsi="Segoe UI Semibold"/>
-          <w:b/>
-          <w:bCs/>
-          <w:color w:val="333333"/>
-          <w:sz w:val="18"/>
-          <w:szCs w:val="18"/>
-        </w:rPr>
-        <w:t>Olá Maria</w:t>
+        <w:t>Resposta: Olá Maria</w:t>
       </w:r>
     </w:p>
     <w:p>
@@ -3213,13 +2946,11 @@
       <w:pPr>
         <w:pStyle w:val="Heading1"/>
         <w:bidi w:val="0"/>
-        <w:spacing w:before="285" w:after="285"/>
+        <w:spacing w:before="0" w:after="285"/>
         <w:jc w:val="center"/>
         <w:rPr>
-          <w:rFonts w:ascii="Segoe UI Black" w:hAnsi="Segoe UI Black"/>
-          <w:color w:val="666666"/>
-          <w:sz w:val="20"/>
-          <w:szCs w:val="20"/>
+          <w:sz w:val="18"/>
+          <w:szCs w:val="18"/>
         </w:rPr>
       </w:pPr>
       <w:r>
@@ -3229,8 +2960,8 @@
         <w:rPr>
           <w:rFonts w:ascii="Segoe UI Black" w:hAnsi="Segoe UI Black"/>
           <w:color w:val="666666"/>
-          <w:sz w:val="20"/>
-          <w:szCs w:val="20"/>
+          <w:sz w:val="18"/>
+          <w:szCs w:val="18"/>
         </w:rPr>
         <w:t xml:space="preserve">🚀 </w:t>
       </w:r>
@@ -3238,8 +2969,8 @@
         <w:rPr>
           <w:rFonts w:ascii="Segoe UI Black" w:hAnsi="Segoe UI Black"/>
           <w:color w:val="666666"/>
-          <w:sz w:val="20"/>
-          <w:szCs w:val="20"/>
+          <w:sz w:val="18"/>
+          <w:szCs w:val="18"/>
         </w:rPr>
         <w:t>Exercícios Práticos</w:t>
       </w:r>
@@ -3803,8 +3534,6 @@
         <w:rPr>
           <w:rFonts w:ascii="Segoe UI Semibold" w:hAnsi="Segoe UI Semibold"/>
           <w:color w:val="333333"/>
-          <w:sz w:val="18"/>
-          <w:szCs w:val="18"/>
         </w:rPr>
       </w:r>
     </w:p>
@@ -5011,10 +4740,8 @@
         <w:spacing w:before="0" w:after="285"/>
         <w:jc w:val="center"/>
         <w:rPr>
-          <w:rFonts w:ascii="Segoe UI Black" w:hAnsi="Segoe UI Black"/>
-          <w:color w:val="666666"/>
-          <w:sz w:val="20"/>
-          <w:szCs w:val="20"/>
+          <w:sz w:val="18"/>
+          <w:szCs w:val="18"/>
         </w:rPr>
       </w:pPr>
       <w:r>
@@ -5024,8 +4751,8 @@
         <w:rPr>
           <w:rFonts w:ascii="Segoe UI Black" w:hAnsi="Segoe UI Black"/>
           <w:color w:val="666666"/>
-          <w:sz w:val="20"/>
-          <w:szCs w:val="20"/>
+          <w:sz w:val="18"/>
+          <w:szCs w:val="18"/>
         </w:rPr>
         <w:t xml:space="preserve">🏆 </w:t>
       </w:r>
@@ -5033,8 +4760,8 @@
         <w:rPr>
           <w:rFonts w:ascii="Segoe UI Black" w:hAnsi="Segoe UI Black"/>
           <w:color w:val="666666"/>
-          <w:sz w:val="20"/>
-          <w:szCs w:val="20"/>
+          <w:sz w:val="18"/>
+          <w:szCs w:val="18"/>
         </w:rPr>
         <w:t>Projeto da Semana</w:t>
       </w:r>
@@ -5402,6 +5129,856 @@
           <w:sz w:val="18"/>
           <w:szCs w:val="18"/>
         </w:rPr>
+        <w:t>let curriculo = {</w:t>
+      </w:r>
+    </w:p>
+    <w:p>
+      <w:pPr>
+        <w:pStyle w:val="BodyText"/>
+        <w:bidi w:val="0"/>
+        <w:spacing w:lineRule="auto" w:line="240" w:before="0" w:after="0"/>
+        <w:jc w:val="start"/>
+        <w:rPr>
+          <w:rFonts w:ascii="Miriam Mono CLM" w:hAnsi="Miriam Mono CLM"/>
+          <w:b/>
+          <w:bCs/>
+          <w:color w:val="333333"/>
+          <w:sz w:val="18"/>
+          <w:szCs w:val="18"/>
+        </w:rPr>
+      </w:pPr>
+      <w:r>
+        <w:rPr>
+          <w:rFonts w:ascii="Miriam Mono CLM" w:hAnsi="Miriam Mono CLM"/>
+          <w:b/>
+          <w:bCs/>
+          <w:color w:val="333333"/>
+          <w:sz w:val="18"/>
+          <w:szCs w:val="18"/>
+        </w:rPr>
+        <w:t xml:space="preserve">    </w:t>
+      </w:r>
+      <w:r>
+        <w:rPr>
+          <w:rFonts w:ascii="Miriam Mono CLM" w:hAnsi="Miriam Mono CLM"/>
+          <w:b/>
+          <w:bCs/>
+          <w:color w:val="333333"/>
+          <w:sz w:val="18"/>
+          <w:szCs w:val="18"/>
+        </w:rPr>
+        <w:t>nome: 'Moisés Viana Honorato',</w:t>
+      </w:r>
+    </w:p>
+    <w:p>
+      <w:pPr>
+        <w:pStyle w:val="BodyText"/>
+        <w:bidi w:val="0"/>
+        <w:spacing w:lineRule="auto" w:line="240" w:before="0" w:after="0"/>
+        <w:jc w:val="start"/>
+        <w:rPr>
+          <w:rFonts w:ascii="Miriam Mono CLM" w:hAnsi="Miriam Mono CLM"/>
+          <w:b/>
+          <w:bCs/>
+          <w:color w:val="333333"/>
+          <w:sz w:val="18"/>
+          <w:szCs w:val="18"/>
+        </w:rPr>
+      </w:pPr>
+      <w:r>
+        <w:rPr>
+          <w:rFonts w:ascii="Miriam Mono CLM" w:hAnsi="Miriam Mono CLM"/>
+          <w:b/>
+          <w:bCs/>
+          <w:color w:val="333333"/>
+          <w:sz w:val="18"/>
+          <w:szCs w:val="18"/>
+        </w:rPr>
+        <w:t xml:space="preserve">    </w:t>
+      </w:r>
+      <w:r>
+        <w:rPr>
+          <w:rFonts w:ascii="Miriam Mono CLM" w:hAnsi="Miriam Mono CLM"/>
+          <w:b/>
+          <w:bCs/>
+          <w:color w:val="333333"/>
+          <w:sz w:val="18"/>
+          <w:szCs w:val="18"/>
+        </w:rPr>
+        <w:t>idade: 21,</w:t>
+      </w:r>
+    </w:p>
+    <w:p>
+      <w:pPr>
+        <w:pStyle w:val="BodyText"/>
+        <w:bidi w:val="0"/>
+        <w:spacing w:lineRule="auto" w:line="240" w:before="0" w:after="0"/>
+        <w:jc w:val="start"/>
+        <w:rPr>
+          <w:rFonts w:ascii="Miriam Mono CLM" w:hAnsi="Miriam Mono CLM"/>
+          <w:b/>
+          <w:bCs/>
+          <w:color w:val="333333"/>
+          <w:sz w:val="18"/>
+          <w:szCs w:val="18"/>
+        </w:rPr>
+      </w:pPr>
+      <w:r>
+        <w:rPr>
+          <w:rFonts w:ascii="Miriam Mono CLM" w:hAnsi="Miriam Mono CLM"/>
+          <w:b/>
+          <w:bCs/>
+          <w:color w:val="333333"/>
+          <w:sz w:val="18"/>
+          <w:szCs w:val="18"/>
+        </w:rPr>
+        <w:t xml:space="preserve">    </w:t>
+      </w:r>
+      <w:r>
+        <w:rPr>
+          <w:rFonts w:ascii="Miriam Mono CLM" w:hAnsi="Miriam Mono CLM"/>
+          <w:b/>
+          <w:bCs/>
+          <w:color w:val="333333"/>
+          <w:sz w:val="18"/>
+          <w:szCs w:val="18"/>
+        </w:rPr>
+        <w:t>endereco: 'Rua das Flores, 123',</w:t>
+      </w:r>
+    </w:p>
+    <w:p>
+      <w:pPr>
+        <w:pStyle w:val="BodyText"/>
+        <w:bidi w:val="0"/>
+        <w:spacing w:lineRule="auto" w:line="240" w:before="0" w:after="0"/>
+        <w:jc w:val="start"/>
+        <w:rPr>
+          <w:rFonts w:ascii="Miriam Mono CLM" w:hAnsi="Miriam Mono CLM"/>
+          <w:b/>
+          <w:bCs/>
+          <w:color w:val="333333"/>
+          <w:sz w:val="18"/>
+          <w:szCs w:val="18"/>
+        </w:rPr>
+      </w:pPr>
+      <w:r>
+        <w:rPr>
+          <w:rFonts w:ascii="Miriam Mono CLM" w:hAnsi="Miriam Mono CLM"/>
+          <w:b/>
+          <w:bCs/>
+          <w:color w:val="333333"/>
+          <w:sz w:val="18"/>
+          <w:szCs w:val="18"/>
+        </w:rPr>
+        <w:t xml:space="preserve">    </w:t>
+      </w:r>
+      <w:r>
+        <w:rPr>
+          <w:rFonts w:ascii="Miriam Mono CLM" w:hAnsi="Miriam Mono CLM"/>
+          <w:b/>
+          <w:bCs/>
+          <w:color w:val="333333"/>
+          <w:sz w:val="18"/>
+          <w:szCs w:val="18"/>
+        </w:rPr>
+        <w:t>telefone: '123456789',</w:t>
+      </w:r>
+    </w:p>
+    <w:p>
+      <w:pPr>
+        <w:pStyle w:val="BodyText"/>
+        <w:bidi w:val="0"/>
+        <w:spacing w:lineRule="auto" w:line="240" w:before="0" w:after="0"/>
+        <w:jc w:val="start"/>
+        <w:rPr>
+          <w:rFonts w:ascii="Miriam Mono CLM" w:hAnsi="Miriam Mono CLM"/>
+          <w:b/>
+          <w:bCs/>
+          <w:color w:val="333333"/>
+          <w:sz w:val="18"/>
+          <w:szCs w:val="18"/>
+        </w:rPr>
+      </w:pPr>
+      <w:r>
+        <w:rPr>
+          <w:rFonts w:ascii="Miriam Mono CLM" w:hAnsi="Miriam Mono CLM"/>
+          <w:b/>
+          <w:bCs/>
+          <w:color w:val="333333"/>
+          <w:sz w:val="18"/>
+          <w:szCs w:val="18"/>
+        </w:rPr>
+        <w:t xml:space="preserve">    </w:t>
+      </w:r>
+      <w:r>
+        <w:rPr>
+          <w:rFonts w:ascii="Miriam Mono CLM" w:hAnsi="Miriam Mono CLM"/>
+          <w:b/>
+          <w:bCs/>
+          <w:color w:val="333333"/>
+          <w:sz w:val="18"/>
+          <w:szCs w:val="18"/>
+        </w:rPr>
+        <w:t>email: 'moises@example.com',</w:t>
+      </w:r>
+    </w:p>
+    <w:p>
+      <w:pPr>
+        <w:pStyle w:val="BodyText"/>
+        <w:bidi w:val="0"/>
+        <w:spacing w:lineRule="auto" w:line="240" w:before="0" w:after="0"/>
+        <w:jc w:val="start"/>
+        <w:rPr>
+          <w:rFonts w:ascii="Miriam Mono CLM" w:hAnsi="Miriam Mono CLM"/>
+          <w:b/>
+          <w:bCs/>
+          <w:color w:val="333333"/>
+          <w:sz w:val="18"/>
+          <w:szCs w:val="18"/>
+        </w:rPr>
+      </w:pPr>
+      <w:r>
+        <w:rPr>
+          <w:rFonts w:ascii="Miriam Mono CLM" w:hAnsi="Miriam Mono CLM"/>
+          <w:b/>
+          <w:bCs/>
+          <w:color w:val="333333"/>
+          <w:sz w:val="18"/>
+          <w:szCs w:val="18"/>
+        </w:rPr>
+        <w:t xml:space="preserve">    </w:t>
+      </w:r>
+      <w:r>
+        <w:rPr>
+          <w:rFonts w:ascii="Miriam Mono CLM" w:hAnsi="Miriam Mono CLM"/>
+          <w:b/>
+          <w:bCs/>
+          <w:color w:val="333333"/>
+          <w:sz w:val="18"/>
+          <w:szCs w:val="18"/>
+        </w:rPr>
+        <w:t>profissao: 'Desenvolvedor Back-End',</w:t>
+      </w:r>
+    </w:p>
+    <w:p>
+      <w:pPr>
+        <w:pStyle w:val="BodyText"/>
+        <w:bidi w:val="0"/>
+        <w:spacing w:lineRule="auto" w:line="240" w:before="0" w:after="0"/>
+        <w:jc w:val="start"/>
+        <w:rPr>
+          <w:rFonts w:ascii="Miriam Mono CLM" w:hAnsi="Miriam Mono CLM"/>
+          <w:b/>
+          <w:bCs/>
+          <w:color w:val="333333"/>
+          <w:sz w:val="18"/>
+          <w:szCs w:val="18"/>
+        </w:rPr>
+      </w:pPr>
+      <w:r>
+        <w:rPr>
+          <w:rFonts w:ascii="Miriam Mono CLM" w:hAnsi="Miriam Mono CLM"/>
+          <w:b/>
+          <w:bCs/>
+          <w:color w:val="333333"/>
+          <w:sz w:val="18"/>
+          <w:szCs w:val="18"/>
+        </w:rPr>
+        <w:t xml:space="preserve">    </w:t>
+      </w:r>
+      <w:r>
+        <w:rPr>
+          <w:rFonts w:ascii="Miriam Mono CLM" w:hAnsi="Miriam Mono CLM"/>
+          <w:b/>
+          <w:bCs/>
+          <w:color w:val="333333"/>
+          <w:sz w:val="18"/>
+          <w:szCs w:val="18"/>
+        </w:rPr>
+        <w:t>escolaridade: 'Ensino Superior',</w:t>
+      </w:r>
+    </w:p>
+    <w:p>
+      <w:pPr>
+        <w:pStyle w:val="BodyText"/>
+        <w:bidi w:val="0"/>
+        <w:spacing w:lineRule="auto" w:line="240" w:before="0" w:after="0"/>
+        <w:jc w:val="start"/>
+        <w:rPr>
+          <w:rFonts w:ascii="Miriam Mono CLM" w:hAnsi="Miriam Mono CLM"/>
+          <w:b/>
+          <w:bCs/>
+          <w:color w:val="333333"/>
+          <w:sz w:val="18"/>
+          <w:szCs w:val="18"/>
+        </w:rPr>
+      </w:pPr>
+      <w:r>
+        <w:rPr>
+          <w:rFonts w:ascii="Miriam Mono CLM" w:hAnsi="Miriam Mono CLM"/>
+          <w:b/>
+          <w:bCs/>
+          <w:color w:val="333333"/>
+          <w:sz w:val="18"/>
+          <w:szCs w:val="18"/>
+        </w:rPr>
+        <w:t xml:space="preserve">    </w:t>
+      </w:r>
+      <w:r>
+        <w:rPr>
+          <w:rFonts w:ascii="Miriam Mono CLM" w:hAnsi="Miriam Mono CLM"/>
+          <w:b/>
+          <w:bCs/>
+          <w:color w:val="333333"/>
+          <w:sz w:val="18"/>
+          <w:szCs w:val="18"/>
+        </w:rPr>
+        <w:t>habilidades: ['JavaScript', 'Node.js', 'Banco de Dados'],</w:t>
+      </w:r>
+    </w:p>
+    <w:p>
+      <w:pPr>
+        <w:pStyle w:val="BodyText"/>
+        <w:bidi w:val="0"/>
+        <w:spacing w:lineRule="auto" w:line="240" w:before="0" w:after="0"/>
+        <w:jc w:val="start"/>
+        <w:rPr>
+          <w:rFonts w:ascii="Miriam Mono CLM" w:hAnsi="Miriam Mono CLM"/>
+          <w:b/>
+          <w:bCs/>
+          <w:color w:val="333333"/>
+          <w:sz w:val="18"/>
+          <w:szCs w:val="18"/>
+        </w:rPr>
+      </w:pPr>
+      <w:r>
+        <w:rPr>
+          <w:rFonts w:ascii="Miriam Mono CLM" w:hAnsi="Miriam Mono CLM"/>
+          <w:b/>
+          <w:bCs/>
+          <w:color w:val="333333"/>
+          <w:sz w:val="18"/>
+          <w:szCs w:val="18"/>
+        </w:rPr>
+        <w:t>};</w:t>
+      </w:r>
+    </w:p>
+    <w:p>
+      <w:pPr>
+        <w:pStyle w:val="BodyText"/>
+        <w:bidi w:val="0"/>
+        <w:spacing w:lineRule="auto" w:line="240" w:before="0" w:after="0"/>
+        <w:jc w:val="start"/>
+        <w:rPr>
+          <w:rFonts w:ascii="Miriam Mono CLM" w:hAnsi="Miriam Mono CLM"/>
+          <w:b/>
+          <w:bCs/>
+          <w:color w:val="333333"/>
+          <w:sz w:val="18"/>
+          <w:szCs w:val="18"/>
+        </w:rPr>
+      </w:pPr>
+      <w:r>
+        <w:rPr>
+          <w:rFonts w:ascii="Miriam Mono CLM" w:hAnsi="Miriam Mono CLM"/>
+          <w:b/>
+          <w:bCs/>
+          <w:color w:val="333333"/>
+          <w:sz w:val="18"/>
+          <w:szCs w:val="18"/>
+        </w:rPr>
+      </w:r>
+    </w:p>
+    <w:p>
+      <w:pPr>
+        <w:pStyle w:val="BodyText"/>
+        <w:bidi w:val="0"/>
+        <w:spacing w:lineRule="auto" w:line="240" w:before="0" w:after="0"/>
+        <w:jc w:val="start"/>
+        <w:rPr>
+          <w:rFonts w:ascii="Miriam Mono CLM" w:hAnsi="Miriam Mono CLM"/>
+          <w:b/>
+          <w:bCs/>
+          <w:color w:val="333333"/>
+          <w:sz w:val="18"/>
+          <w:szCs w:val="18"/>
+        </w:rPr>
+      </w:pPr>
+      <w:r>
+        <w:rPr>
+          <w:rFonts w:ascii="Miriam Mono CLM" w:hAnsi="Miriam Mono CLM"/>
+          <w:b/>
+          <w:bCs/>
+          <w:color w:val="333333"/>
+          <w:sz w:val="18"/>
+          <w:szCs w:val="18"/>
+        </w:rPr>
+        <w:t>console.log(`-----------------------------------`);</w:t>
+      </w:r>
+    </w:p>
+    <w:p>
+      <w:pPr>
+        <w:pStyle w:val="BodyText"/>
+        <w:bidi w:val="0"/>
+        <w:spacing w:lineRule="auto" w:line="240" w:before="0" w:after="0"/>
+        <w:jc w:val="start"/>
+        <w:rPr>
+          <w:rFonts w:ascii="Miriam Mono CLM" w:hAnsi="Miriam Mono CLM"/>
+          <w:b/>
+          <w:bCs/>
+          <w:color w:val="333333"/>
+          <w:sz w:val="18"/>
+          <w:szCs w:val="18"/>
+        </w:rPr>
+      </w:pPr>
+      <w:r>
+        <w:rPr>
+          <w:rFonts w:ascii="Miriam Mono CLM" w:hAnsi="Miriam Mono CLM"/>
+          <w:b/>
+          <w:bCs/>
+          <w:color w:val="333333"/>
+          <w:sz w:val="18"/>
+          <w:szCs w:val="18"/>
+        </w:rPr>
+        <w:t>console.log(`             Currículo             `);</w:t>
+      </w:r>
+    </w:p>
+    <w:p>
+      <w:pPr>
+        <w:pStyle w:val="BodyText"/>
+        <w:bidi w:val="0"/>
+        <w:spacing w:lineRule="auto" w:line="240" w:before="0" w:after="0"/>
+        <w:jc w:val="start"/>
+        <w:rPr>
+          <w:rFonts w:ascii="Miriam Mono CLM" w:hAnsi="Miriam Mono CLM"/>
+          <w:b/>
+          <w:bCs/>
+          <w:color w:val="333333"/>
+          <w:sz w:val="18"/>
+          <w:szCs w:val="18"/>
+        </w:rPr>
+      </w:pPr>
+      <w:r>
+        <w:rPr>
+          <w:rFonts w:ascii="Miriam Mono CLM" w:hAnsi="Miriam Mono CLM"/>
+          <w:b/>
+          <w:bCs/>
+          <w:color w:val="333333"/>
+          <w:sz w:val="18"/>
+          <w:szCs w:val="18"/>
+        </w:rPr>
+        <w:t>console.log(`-----------------------------------`);</w:t>
+      </w:r>
+    </w:p>
+    <w:p>
+      <w:pPr>
+        <w:pStyle w:val="BodyText"/>
+        <w:bidi w:val="0"/>
+        <w:spacing w:lineRule="auto" w:line="240" w:before="0" w:after="0"/>
+        <w:jc w:val="start"/>
+        <w:rPr>
+          <w:rFonts w:ascii="Miriam Mono CLM" w:hAnsi="Miriam Mono CLM"/>
+          <w:b/>
+          <w:bCs/>
+          <w:color w:val="333333"/>
+          <w:sz w:val="18"/>
+          <w:szCs w:val="18"/>
+        </w:rPr>
+      </w:pPr>
+      <w:r>
+        <w:rPr>
+          <w:rFonts w:ascii="Miriam Mono CLM" w:hAnsi="Miriam Mono CLM"/>
+          <w:b/>
+          <w:bCs/>
+          <w:color w:val="333333"/>
+          <w:sz w:val="18"/>
+          <w:szCs w:val="18"/>
+        </w:rPr>
+        <w:t>console.log(`Nome: ${curriculo.nome}`);</w:t>
+      </w:r>
+    </w:p>
+    <w:p>
+      <w:pPr>
+        <w:pStyle w:val="BodyText"/>
+        <w:bidi w:val="0"/>
+        <w:spacing w:lineRule="auto" w:line="240" w:before="0" w:after="0"/>
+        <w:jc w:val="start"/>
+        <w:rPr>
+          <w:rFonts w:ascii="Miriam Mono CLM" w:hAnsi="Miriam Mono CLM"/>
+          <w:b/>
+          <w:bCs/>
+          <w:color w:val="333333"/>
+          <w:sz w:val="18"/>
+          <w:szCs w:val="18"/>
+        </w:rPr>
+      </w:pPr>
+      <w:r>
+        <w:rPr>
+          <w:rFonts w:ascii="Miriam Mono CLM" w:hAnsi="Miriam Mono CLM"/>
+          <w:b/>
+          <w:bCs/>
+          <w:color w:val="333333"/>
+          <w:sz w:val="18"/>
+          <w:szCs w:val="18"/>
+        </w:rPr>
+        <w:t>console.log(`Idade: ${curriculo.idade}`);</w:t>
+      </w:r>
+    </w:p>
+    <w:p>
+      <w:pPr>
+        <w:pStyle w:val="BodyText"/>
+        <w:bidi w:val="0"/>
+        <w:spacing w:lineRule="auto" w:line="240" w:before="0" w:after="0"/>
+        <w:jc w:val="start"/>
+        <w:rPr>
+          <w:rFonts w:ascii="Miriam Mono CLM" w:hAnsi="Miriam Mono CLM"/>
+          <w:b/>
+          <w:bCs/>
+          <w:color w:val="333333"/>
+          <w:sz w:val="18"/>
+          <w:szCs w:val="18"/>
+        </w:rPr>
+      </w:pPr>
+      <w:r>
+        <w:rPr>
+          <w:rFonts w:ascii="Miriam Mono CLM" w:hAnsi="Miriam Mono CLM"/>
+          <w:b/>
+          <w:bCs/>
+          <w:color w:val="333333"/>
+          <w:sz w:val="18"/>
+          <w:szCs w:val="18"/>
+        </w:rPr>
+        <w:t>console.log('');</w:t>
+      </w:r>
+    </w:p>
+    <w:p>
+      <w:pPr>
+        <w:pStyle w:val="BodyText"/>
+        <w:bidi w:val="0"/>
+        <w:spacing w:lineRule="auto" w:line="240" w:before="0" w:after="0"/>
+        <w:jc w:val="start"/>
+        <w:rPr>
+          <w:rFonts w:ascii="Miriam Mono CLM" w:hAnsi="Miriam Mono CLM"/>
+          <w:b/>
+          <w:bCs/>
+          <w:color w:val="333333"/>
+          <w:sz w:val="18"/>
+          <w:szCs w:val="18"/>
+        </w:rPr>
+      </w:pPr>
+      <w:r>
+        <w:rPr>
+          <w:rFonts w:ascii="Miriam Mono CLM" w:hAnsi="Miriam Mono CLM"/>
+          <w:b/>
+          <w:bCs/>
+          <w:color w:val="333333"/>
+          <w:sz w:val="18"/>
+          <w:szCs w:val="18"/>
+        </w:rPr>
+        <w:t>console.log(`Telefone: ${curriculo.telefone}`);</w:t>
+      </w:r>
+    </w:p>
+    <w:p>
+      <w:pPr>
+        <w:pStyle w:val="BodyText"/>
+        <w:bidi w:val="0"/>
+        <w:spacing w:lineRule="auto" w:line="240" w:before="0" w:after="0"/>
+        <w:jc w:val="start"/>
+        <w:rPr>
+          <w:rFonts w:ascii="Miriam Mono CLM" w:hAnsi="Miriam Mono CLM"/>
+          <w:b/>
+          <w:bCs/>
+          <w:color w:val="333333"/>
+          <w:sz w:val="18"/>
+          <w:szCs w:val="18"/>
+        </w:rPr>
+      </w:pPr>
+      <w:r>
+        <w:rPr>
+          <w:rFonts w:ascii="Miriam Mono CLM" w:hAnsi="Miriam Mono CLM"/>
+          <w:b/>
+          <w:bCs/>
+          <w:color w:val="333333"/>
+          <w:sz w:val="18"/>
+          <w:szCs w:val="18"/>
+        </w:rPr>
+        <w:t>console.log(`Email: ${curriculo.email}`);</w:t>
+      </w:r>
+    </w:p>
+    <w:p>
+      <w:pPr>
+        <w:pStyle w:val="BodyText"/>
+        <w:bidi w:val="0"/>
+        <w:spacing w:lineRule="auto" w:line="240" w:before="0" w:after="0"/>
+        <w:jc w:val="start"/>
+        <w:rPr>
+          <w:rFonts w:ascii="Miriam Mono CLM" w:hAnsi="Miriam Mono CLM"/>
+          <w:b/>
+          <w:bCs/>
+          <w:color w:val="333333"/>
+          <w:sz w:val="18"/>
+          <w:szCs w:val="18"/>
+        </w:rPr>
+      </w:pPr>
+      <w:r>
+        <w:rPr>
+          <w:rFonts w:ascii="Miriam Mono CLM" w:hAnsi="Miriam Mono CLM"/>
+          <w:b/>
+          <w:bCs/>
+          <w:color w:val="333333"/>
+          <w:sz w:val="18"/>
+          <w:szCs w:val="18"/>
+        </w:rPr>
+        <w:t>console.log(`Endereço: ${curriculo.endereco}`);</w:t>
+      </w:r>
+    </w:p>
+    <w:p>
+      <w:pPr>
+        <w:pStyle w:val="BodyText"/>
+        <w:bidi w:val="0"/>
+        <w:spacing w:lineRule="auto" w:line="240" w:before="0" w:after="0"/>
+        <w:jc w:val="start"/>
+        <w:rPr>
+          <w:rFonts w:ascii="Miriam Mono CLM" w:hAnsi="Miriam Mono CLM"/>
+          <w:b/>
+          <w:bCs/>
+          <w:color w:val="333333"/>
+          <w:sz w:val="18"/>
+          <w:szCs w:val="18"/>
+        </w:rPr>
+      </w:pPr>
+      <w:r>
+        <w:rPr>
+          <w:rFonts w:ascii="Miriam Mono CLM" w:hAnsi="Miriam Mono CLM"/>
+          <w:b/>
+          <w:bCs/>
+          <w:color w:val="333333"/>
+          <w:sz w:val="18"/>
+          <w:szCs w:val="18"/>
+        </w:rPr>
+        <w:t>console.log('');</w:t>
+      </w:r>
+    </w:p>
+    <w:p>
+      <w:pPr>
+        <w:pStyle w:val="BodyText"/>
+        <w:bidi w:val="0"/>
+        <w:spacing w:lineRule="auto" w:line="240" w:before="0" w:after="0"/>
+        <w:jc w:val="start"/>
+        <w:rPr>
+          <w:rFonts w:ascii="Miriam Mono CLM" w:hAnsi="Miriam Mono CLM"/>
+          <w:b/>
+          <w:bCs/>
+          <w:color w:val="333333"/>
+          <w:sz w:val="18"/>
+          <w:szCs w:val="18"/>
+        </w:rPr>
+      </w:pPr>
+      <w:r>
+        <w:rPr>
+          <w:rFonts w:ascii="Miriam Mono CLM" w:hAnsi="Miriam Mono CLM"/>
+          <w:b/>
+          <w:bCs/>
+          <w:color w:val="333333"/>
+          <w:sz w:val="18"/>
+          <w:szCs w:val="18"/>
+        </w:rPr>
+        <w:t>console.log(`Habilidades:</w:t>
+      </w:r>
+    </w:p>
+    <w:p>
+      <w:pPr>
+        <w:pStyle w:val="BodyText"/>
+        <w:bidi w:val="0"/>
+        <w:spacing w:lineRule="auto" w:line="240" w:before="0" w:after="0"/>
+        <w:jc w:val="start"/>
+        <w:rPr>
+          <w:rFonts w:ascii="Miriam Mono CLM" w:hAnsi="Miriam Mono CLM"/>
+          <w:b/>
+          <w:bCs/>
+          <w:color w:val="333333"/>
+          <w:sz w:val="18"/>
+          <w:szCs w:val="18"/>
+        </w:rPr>
+      </w:pPr>
+      <w:r>
+        <w:rPr>
+          <w:rFonts w:ascii="Miriam Mono CLM" w:hAnsi="Miriam Mono CLM"/>
+          <w:b/>
+          <w:bCs/>
+          <w:color w:val="333333"/>
+          <w:sz w:val="18"/>
+          <w:szCs w:val="18"/>
+        </w:rPr>
+        <w:t xml:space="preserve"> </w:t>
+      </w:r>
+      <w:r>
+        <w:rPr>
+          <w:rFonts w:ascii="Miriam Mono CLM" w:hAnsi="Miriam Mono CLM"/>
+          <w:b/>
+          <w:bCs/>
+          <w:color w:val="333333"/>
+          <w:sz w:val="18"/>
+          <w:szCs w:val="18"/>
+        </w:rPr>
+        <w:t>- ${curriculo.habilidades[0]}</w:t>
+      </w:r>
+    </w:p>
+    <w:p>
+      <w:pPr>
+        <w:pStyle w:val="BodyText"/>
+        <w:bidi w:val="0"/>
+        <w:spacing w:lineRule="auto" w:line="240" w:before="0" w:after="0"/>
+        <w:jc w:val="start"/>
+        <w:rPr>
+          <w:rFonts w:ascii="Miriam Mono CLM" w:hAnsi="Miriam Mono CLM"/>
+          <w:b/>
+          <w:bCs/>
+          <w:color w:val="333333"/>
+          <w:sz w:val="18"/>
+          <w:szCs w:val="18"/>
+        </w:rPr>
+      </w:pPr>
+      <w:r>
+        <w:rPr>
+          <w:rFonts w:ascii="Miriam Mono CLM" w:hAnsi="Miriam Mono CLM"/>
+          <w:b/>
+          <w:bCs/>
+          <w:color w:val="333333"/>
+          <w:sz w:val="18"/>
+          <w:szCs w:val="18"/>
+        </w:rPr>
+        <w:t xml:space="preserve"> </w:t>
+      </w:r>
+      <w:r>
+        <w:rPr>
+          <w:rFonts w:ascii="Miriam Mono CLM" w:hAnsi="Miriam Mono CLM"/>
+          <w:b/>
+          <w:bCs/>
+          <w:color w:val="333333"/>
+          <w:sz w:val="18"/>
+          <w:szCs w:val="18"/>
+        </w:rPr>
+        <w:t>- ${curriculo.habilidades[1]}</w:t>
+      </w:r>
+    </w:p>
+    <w:p>
+      <w:pPr>
+        <w:pStyle w:val="BodyText"/>
+        <w:bidi w:val="0"/>
+        <w:spacing w:lineRule="auto" w:line="240" w:before="0" w:after="0"/>
+        <w:jc w:val="start"/>
+        <w:rPr>
+          <w:rFonts w:ascii="Miriam Mono CLM" w:hAnsi="Miriam Mono CLM"/>
+          <w:b/>
+          <w:bCs/>
+          <w:color w:val="333333"/>
+          <w:sz w:val="18"/>
+          <w:szCs w:val="18"/>
+        </w:rPr>
+      </w:pPr>
+      <w:r>
+        <w:rPr>
+          <w:rFonts w:ascii="Miriam Mono CLM" w:hAnsi="Miriam Mono CLM"/>
+          <w:b/>
+          <w:bCs/>
+          <w:color w:val="333333"/>
+          <w:sz w:val="18"/>
+          <w:szCs w:val="18"/>
+        </w:rPr>
+        <w:t xml:space="preserve"> </w:t>
+      </w:r>
+      <w:r>
+        <w:rPr>
+          <w:rFonts w:ascii="Miriam Mono CLM" w:hAnsi="Miriam Mono CLM"/>
+          <w:b/>
+          <w:bCs/>
+          <w:color w:val="333333"/>
+          <w:sz w:val="18"/>
+          <w:szCs w:val="18"/>
+        </w:rPr>
+        <w:t>- ${curriculo.habilidades[2]}`);</w:t>
+      </w:r>
+    </w:p>
+    <w:p>
+      <w:pPr>
+        <w:pStyle w:val="BodyText"/>
+        <w:bidi w:val="0"/>
+        <w:spacing w:lineRule="auto" w:line="240" w:before="0" w:after="0"/>
+        <w:jc w:val="start"/>
+        <w:rPr>
+          <w:rFonts w:ascii="Miriam Mono CLM" w:hAnsi="Miriam Mono CLM"/>
+          <w:b/>
+          <w:bCs/>
+          <w:color w:val="333333"/>
+          <w:sz w:val="18"/>
+          <w:szCs w:val="18"/>
+        </w:rPr>
+      </w:pPr>
+      <w:r>
+        <w:rPr>
+          <w:rFonts w:ascii="Miriam Mono CLM" w:hAnsi="Miriam Mono CLM"/>
+          <w:b/>
+          <w:bCs/>
+          <w:color w:val="333333"/>
+          <w:sz w:val="18"/>
+          <w:szCs w:val="18"/>
+        </w:rPr>
+        <w:t>console.log('');</w:t>
+      </w:r>
+    </w:p>
+    <w:p>
+      <w:pPr>
+        <w:pStyle w:val="BodyText"/>
+        <w:bidi w:val="0"/>
+        <w:spacing w:lineRule="auto" w:line="240" w:before="0" w:after="0"/>
+        <w:jc w:val="start"/>
+        <w:rPr>
+          <w:rFonts w:ascii="Miriam Mono CLM" w:hAnsi="Miriam Mono CLM"/>
+          <w:b/>
+          <w:bCs/>
+          <w:color w:val="333333"/>
+          <w:sz w:val="18"/>
+          <w:szCs w:val="18"/>
+        </w:rPr>
+      </w:pPr>
+      <w:r>
+        <w:rPr>
+          <w:rFonts w:ascii="Miriam Mono CLM" w:hAnsi="Miriam Mono CLM"/>
+          <w:b/>
+          <w:bCs/>
+          <w:color w:val="333333"/>
+          <w:sz w:val="18"/>
+          <w:szCs w:val="18"/>
+        </w:rPr>
+        <w:t>console.log(`Profissão: ${curriculo.profissao}`);</w:t>
+      </w:r>
+    </w:p>
+    <w:p>
+      <w:pPr>
+        <w:pStyle w:val="BodyText"/>
+        <w:bidi w:val="0"/>
+        <w:spacing w:lineRule="auto" w:line="240" w:before="0" w:after="0"/>
+        <w:jc w:val="start"/>
+        <w:rPr>
+          <w:rFonts w:ascii="Miriam Mono CLM" w:hAnsi="Miriam Mono CLM"/>
+          <w:b/>
+          <w:bCs/>
+          <w:color w:val="333333"/>
+          <w:sz w:val="18"/>
+          <w:szCs w:val="18"/>
+        </w:rPr>
+      </w:pPr>
+      <w:r>
+        <w:rPr>
+          <w:rFonts w:ascii="Miriam Mono CLM" w:hAnsi="Miriam Mono CLM"/>
+          <w:b/>
+          <w:bCs/>
+          <w:color w:val="333333"/>
+          <w:sz w:val="18"/>
+          <w:szCs w:val="18"/>
+        </w:rPr>
+        <w:t>console.log(`Escolaridade: ${curriculo.escolaridade}`);</w:t>
       </w:r>
     </w:p>
     <w:p>
@@ -5450,16 +6027,6 @@
           <w:sz w:val="20"/>
           <w:szCs w:val="20"/>
         </w:rPr>
-        <w:t xml:space="preserve">📖 </w:t>
-      </w:r>
-      <w:r>
-        <w:rPr>
-          <w:rFonts w:ascii="Segoe UI Black" w:hAnsi="Segoe UI Black"/>
-          <w:color w:val="666666"/>
-          <w:sz w:val="20"/>
-          <w:szCs w:val="20"/>
-        </w:rPr>
-        <w:t>Pesquisa Preparatórias</w:t>
       </w:r>
     </w:p>
     <w:p>
@@ -5469,71 +6036,73 @@
         <w:spacing w:before="0" w:after="0"/>
         <w:jc w:val="center"/>
         <w:rPr>
-          <w:rFonts w:ascii="Segoe UI Black" w:hAnsi="Segoe UI Black"/>
-          <w:color w:val="666666"/>
-          <w:sz w:val="20"/>
-          <w:szCs w:val="20"/>
-        </w:rPr>
-      </w:pPr>
-      <w:r>
-        <w:rPr>
-          <w:rFonts w:ascii="Segoe UI Semibold" w:hAnsi="Segoe UI Semibold"/>
-          <w:color w:val="333333"/>
-          <w:sz w:val="20"/>
-          <w:szCs w:val="20"/>
-        </w:rPr>
-        <w:t>Pesquise e responda as seguintes questões antes de iniciar a Semana 2:</w:t>
-      </w:r>
-    </w:p>
-    <w:p>
-      <w:pPr>
-        <w:pStyle w:val="BodyText"/>
+          <w:sz w:val="18"/>
+          <w:szCs w:val="18"/>
+        </w:rPr>
+      </w:pPr>
+      <w:r>
+        <w:br w:type="column"/>
+      </w:r>
+      <w:r>
+        <w:rPr>
+          <w:rFonts w:ascii="Segoe UI Black" w:hAnsi="Segoe UI Black"/>
+          <w:color w:val="666666"/>
+          <w:sz w:val="18"/>
+          <w:szCs w:val="18"/>
+        </w:rPr>
+        <w:t xml:space="preserve">📖 </w:t>
+      </w:r>
+      <w:r>
+        <w:rPr>
+          <w:rFonts w:ascii="Segoe UI Black" w:hAnsi="Segoe UI Black"/>
+          <w:color w:val="666666"/>
+          <w:sz w:val="18"/>
+          <w:szCs w:val="18"/>
+        </w:rPr>
+        <w:t>Pesquisa Preparatórias</w:t>
+      </w:r>
+    </w:p>
+    <w:p>
+      <w:pPr>
+        <w:pStyle w:val="Heading1"/>
         <w:bidi w:val="0"/>
         <w:spacing w:before="0" w:after="0"/>
         <w:jc w:val="center"/>
         <w:rPr>
-          <w:rFonts w:ascii="Segoe UI Semibold" w:hAnsi="Segoe UI Semibold"/>
-          <w:color w:val="333333"/>
-          <w:sz w:val="20"/>
-          <w:szCs w:val="20"/>
-        </w:rPr>
-      </w:pPr>
-      <w:r>
-        <w:rPr>
-          <w:rFonts w:ascii="Segoe UI Semibold" w:hAnsi="Segoe UI Semibold"/>
-          <w:color w:val="333333"/>
-          <w:sz w:val="20"/>
-          <w:szCs w:val="20"/>
-        </w:rPr>
-      </w:r>
-    </w:p>
-    <w:p>
-      <w:pPr>
-        <w:pStyle w:val="BodyText"/>
-        <w:numPr>
-          <w:ilvl w:val="0"/>
-          <w:numId w:val="5"/>
-        </w:numPr>
-        <w:tabs>
-          <w:tab w:val="left" w:pos="709" w:leader="none"/>
-        </w:tabs>
-        <w:bidi w:val="0"/>
-        <w:spacing w:lineRule="auto" w:line="240" w:before="0" w:after="0"/>
-        <w:ind w:hanging="283" w:start="709"/>
-        <w:jc w:val="start"/>
-        <w:rPr>
-          <w:sz w:val="18"/>
-          <w:szCs w:val="18"/>
-        </w:rPr>
-      </w:pPr>
-      <w:r>
-        <w:rPr>
-          <w:rFonts w:ascii="Segoe UI Black" w:hAnsi="Segoe UI Black"/>
-          <w:color w:val="666666"/>
-          <w:sz w:val="18"/>
-          <w:szCs w:val="18"/>
-        </w:rPr>
-        <w:t xml:space="preserve">O que é ECMAScript? </w:t>
+          <w:sz w:val="18"/>
+          <w:szCs w:val="18"/>
+        </w:rPr>
+      </w:pPr>
+      <w:r>
+        <w:rPr>
+          <w:rFonts w:ascii="Segoe UI Semibold" w:hAnsi="Segoe UI Semibold"/>
+          <w:color w:val="333333"/>
+          <w:sz w:val="18"/>
+          <w:szCs w:val="18"/>
+        </w:rPr>
+        <w:t>Pesquise e responda as seguintes questões antes de iniciar a Semana 2:</w:t>
+      </w:r>
+    </w:p>
+    <w:p>
+      <w:pPr>
+        <w:pStyle w:val="BodyText"/>
+        <w:bidi w:val="0"/>
+        <w:spacing w:before="0" w:after="0"/>
+        <w:jc w:val="center"/>
+        <w:rPr>
+          <w:rFonts w:ascii="Segoe UI Semibold" w:hAnsi="Segoe UI Semibold"/>
+          <w:color w:val="333333"/>
+          <w:sz w:val="18"/>
+          <w:szCs w:val="18"/>
+        </w:rPr>
+      </w:pPr>
+      <w:r>
+        <w:rPr>
+          <w:rFonts w:ascii="Segoe UI Semibold" w:hAnsi="Segoe UI Semibold"/>
+          <w:color w:val="333333"/>
+          <w:sz w:val="18"/>
+          <w:szCs w:val="18"/>
+        </w:rPr>
       </w:r>
     </w:p>
     <w:p>
@@ -5543,23 +6112,41 @@
           <w:ilvl w:val="0"/>
           <w:numId w:val="0"/>
         </w:numPr>
+        <w:tabs>
+          <w:tab w:val="left" w:pos="709" w:leader="none"/>
+        </w:tabs>
         <w:bidi w:val="0"/>
         <w:spacing w:lineRule="auto" w:line="240" w:before="0" w:after="0"/>
         <w:ind w:hanging="0" w:start="0"/>
         <w:jc w:val="start"/>
         <w:rPr>
-          <w:sz w:val="18"/>
-          <w:szCs w:val="18"/>
-        </w:rPr>
-      </w:pPr>
-      <w:r>
-        <w:rPr>
-          <w:rFonts w:ascii="Segoe UI Semibold" w:hAnsi="Segoe UI Semibold"/>
-          <w:color w:val="333333"/>
-          <w:sz w:val="18"/>
-          <w:szCs w:val="18"/>
-        </w:rPr>
-        <w:t xml:space="preserve">Resposta: </w:t>
+          <w:b/>
+          <w:bCs/>
+          <w:sz w:val="18"/>
+          <w:szCs w:val="18"/>
+        </w:rPr>
+      </w:pPr>
+      <w:r>
+        <w:rPr>
+          <w:rFonts w:ascii="Segoe UI Black" w:hAnsi="Segoe UI Black"/>
+          <w:b/>
+          <w:bCs/>
+          <w:color w:val="666666"/>
+          <w:sz w:val="18"/>
+          <w:szCs w:val="18"/>
+        </w:rPr>
+        <w:t xml:space="preserve">1. </w:t>
+      </w:r>
+      <w:r>
+        <w:rPr>
+          <w:rFonts w:ascii="Segoe UI Black" w:hAnsi="Segoe UI Black"/>
+          <w:b/>
+          <w:bCs/>
+          <w:color w:val="666666"/>
+          <w:sz w:val="18"/>
+          <w:szCs w:val="18"/>
+        </w:rPr>
+        <w:t xml:space="preserve">O que é ECMAScript? </w:t>
       </w:r>
     </w:p>
     <w:p>
@@ -5574,48 +6161,22 @@
         <w:ind w:hanging="0" w:start="0"/>
         <w:jc w:val="start"/>
         <w:rPr>
-          <w:rFonts w:ascii="Segoe UI Semibold" w:hAnsi="Segoe UI Semibold"/>
-          <w:color w:val="333333"/>
-          <w:sz w:val="18"/>
-          <w:szCs w:val="18"/>
-        </w:rPr>
-      </w:pPr>
-      <w:r>
-        <w:rPr>
-          <w:rFonts w:ascii="Segoe UI Semibold" w:hAnsi="Segoe UI Semibold"/>
-          <w:color w:val="333333"/>
-          <w:sz w:val="18"/>
-          <w:szCs w:val="18"/>
-        </w:rPr>
-      </w:r>
-    </w:p>
-    <w:p>
-      <w:pPr>
-        <w:pStyle w:val="BodyText"/>
-        <w:numPr>
-          <w:ilvl w:val="0"/>
-          <w:numId w:val="5"/>
-        </w:numPr>
-        <w:tabs>
-          <w:tab w:val="left" w:pos="709" w:leader="none"/>
-        </w:tabs>
-        <w:bidi w:val="0"/>
-        <w:spacing w:lineRule="auto" w:line="240" w:before="0" w:after="0"/>
-        <w:ind w:hanging="283" w:start="709"/>
-        <w:jc w:val="start"/>
-        <w:rPr>
-          <w:sz w:val="18"/>
-          <w:szCs w:val="18"/>
-        </w:rPr>
-      </w:pPr>
-      <w:r>
-        <w:rPr>
-          <w:rFonts w:ascii="Segoe UI Black" w:hAnsi="Segoe UI Black"/>
-          <w:color w:val="666666"/>
-          <w:sz w:val="18"/>
-          <w:szCs w:val="18"/>
-        </w:rPr>
-        <w:t xml:space="preserve">Qual a diferença entre JavaScript e ECMAScript? </w:t>
+          <w:b/>
+          <w:bCs/>
+          <w:sz w:val="18"/>
+          <w:szCs w:val="18"/>
+        </w:rPr>
+      </w:pPr>
+      <w:r>
+        <w:rPr>
+          <w:rFonts w:ascii="Segoe UI Semibold" w:hAnsi="Segoe UI Semibold"/>
+          <w:b/>
+          <w:bCs/>
+          <w:color w:val="333333"/>
+          <w:sz w:val="18"/>
+          <w:szCs w:val="18"/>
+        </w:rPr>
+        <w:t>Resposta: ECMAScript é o conjunto de regras de sintaxe e padronização da linguagem JavaScript. Ela define como a linguagem deve funcionar.</w:t>
       </w:r>
     </w:p>
     <w:p>
@@ -5630,18 +6191,23 @@
         <w:ind w:hanging="0" w:start="0"/>
         <w:jc w:val="start"/>
         <w:rPr>
-          <w:sz w:val="18"/>
-          <w:szCs w:val="18"/>
-        </w:rPr>
-      </w:pPr>
-      <w:r>
-        <w:rPr>
-          <w:rFonts w:ascii="Segoe UI Semibold" w:hAnsi="Segoe UI Semibold"/>
-          <w:color w:val="333333"/>
-          <w:sz w:val="18"/>
-          <w:szCs w:val="18"/>
-        </w:rPr>
-        <w:t xml:space="preserve">Resposta: </w:t>
+          <w:rFonts w:ascii="Segoe UI Semibold" w:hAnsi="Segoe UI Semibold"/>
+          <w:b/>
+          <w:bCs/>
+          <w:color w:val="333333"/>
+          <w:sz w:val="18"/>
+          <w:szCs w:val="18"/>
+        </w:rPr>
+      </w:pPr>
+      <w:r>
+        <w:rPr>
+          <w:rFonts w:ascii="Segoe UI Semibold" w:hAnsi="Segoe UI Semibold"/>
+          <w:b/>
+          <w:bCs/>
+          <w:color w:val="333333"/>
+          <w:sz w:val="18"/>
+          <w:szCs w:val="18"/>
+        </w:rPr>
       </w:r>
     </w:p>
     <w:p>
@@ -5651,53 +6217,41 @@
           <w:ilvl w:val="0"/>
           <w:numId w:val="0"/>
         </w:numPr>
+        <w:tabs>
+          <w:tab w:val="left" w:pos="709" w:leader="none"/>
+        </w:tabs>
         <w:bidi w:val="0"/>
         <w:spacing w:lineRule="auto" w:line="240" w:before="0" w:after="0"/>
         <w:ind w:hanging="0" w:start="0"/>
         <w:jc w:val="start"/>
         <w:rPr>
-          <w:rFonts w:ascii="Segoe UI Semibold" w:hAnsi="Segoe UI Semibold"/>
-          <w:color w:val="333333"/>
-          <w:sz w:val="18"/>
-          <w:szCs w:val="18"/>
-        </w:rPr>
-      </w:pPr>
-      <w:r>
-        <w:rPr>
-          <w:rFonts w:ascii="Segoe UI Semibold" w:hAnsi="Segoe UI Semibold"/>
-          <w:color w:val="333333"/>
-          <w:sz w:val="18"/>
-          <w:szCs w:val="18"/>
-        </w:rPr>
-      </w:r>
-    </w:p>
-    <w:p>
-      <w:pPr>
-        <w:pStyle w:val="BodyText"/>
-        <w:numPr>
-          <w:ilvl w:val="0"/>
-          <w:numId w:val="5"/>
-        </w:numPr>
-        <w:tabs>
-          <w:tab w:val="left" w:pos="709" w:leader="none"/>
-        </w:tabs>
-        <w:bidi w:val="0"/>
-        <w:spacing w:lineRule="auto" w:line="240" w:before="0" w:after="0"/>
-        <w:ind w:hanging="283" w:start="709"/>
-        <w:jc w:val="start"/>
-        <w:rPr>
-          <w:sz w:val="18"/>
-          <w:szCs w:val="18"/>
-        </w:rPr>
-      </w:pPr>
-      <w:r>
-        <w:rPr>
-          <w:rFonts w:ascii="Segoe UI Black" w:hAnsi="Segoe UI Black"/>
-          <w:color w:val="666666"/>
-          <w:sz w:val="18"/>
-          <w:szCs w:val="18"/>
-        </w:rPr>
-        <w:t xml:space="preserve">O que é a MDN? </w:t>
+          <w:b/>
+          <w:bCs/>
+          <w:sz w:val="18"/>
+          <w:szCs w:val="18"/>
+        </w:rPr>
+      </w:pPr>
+      <w:r>
+        <w:rPr>
+          <w:rFonts w:ascii="Segoe UI Black" w:hAnsi="Segoe UI Black"/>
+          <w:b/>
+          <w:bCs/>
+          <w:color w:val="666666"/>
+          <w:sz w:val="18"/>
+          <w:szCs w:val="18"/>
+        </w:rPr>
+        <w:t xml:space="preserve">2. </w:t>
+      </w:r>
+      <w:r>
+        <w:rPr>
+          <w:rFonts w:ascii="Segoe UI Black" w:hAnsi="Segoe UI Black"/>
+          <w:b/>
+          <w:bCs/>
+          <w:color w:val="666666"/>
+          <w:sz w:val="18"/>
+          <w:szCs w:val="18"/>
+        </w:rPr>
+        <w:t xml:space="preserve">Qual a diferença entre JavaScript e ECMAScript? </w:t>
       </w:r>
     </w:p>
     <w:p>
@@ -5712,18 +6266,22 @@
         <w:ind w:hanging="0" w:start="0"/>
         <w:jc w:val="start"/>
         <w:rPr>
-          <w:sz w:val="18"/>
-          <w:szCs w:val="18"/>
-        </w:rPr>
-      </w:pPr>
-      <w:r>
-        <w:rPr>
-          <w:rFonts w:ascii="Segoe UI Semibold" w:hAnsi="Segoe UI Semibold"/>
-          <w:color w:val="333333"/>
-          <w:sz w:val="18"/>
-          <w:szCs w:val="18"/>
-        </w:rPr>
-        <w:t xml:space="preserve">Resposta: </w:t>
+          <w:b/>
+          <w:bCs/>
+          <w:sz w:val="18"/>
+          <w:szCs w:val="18"/>
+        </w:rPr>
+      </w:pPr>
+      <w:r>
+        <w:rPr>
+          <w:rFonts w:ascii="Segoe UI Semibold" w:hAnsi="Segoe UI Semibold"/>
+          <w:b/>
+          <w:bCs/>
+          <w:color w:val="333333"/>
+          <w:sz w:val="18"/>
+          <w:szCs w:val="18"/>
+        </w:rPr>
+        <w:t>Resposta:  JavaScript é uma liguangem de programação, e  ECMAScript são as especificações de padronização da linguagem JavaScript.</w:t>
       </w:r>
     </w:p>
     <w:p>
@@ -5739,47 +6297,22 @@
         <w:jc w:val="start"/>
         <w:rPr>
           <w:rFonts w:ascii="Segoe UI Semibold" w:hAnsi="Segoe UI Semibold"/>
-          <w:color w:val="333333"/>
-          <w:sz w:val="18"/>
-          <w:szCs w:val="18"/>
-        </w:rPr>
-      </w:pPr>
-      <w:r>
-        <w:rPr>
-          <w:rFonts w:ascii="Segoe UI Semibold" w:hAnsi="Segoe UI Semibold"/>
-          <w:color w:val="333333"/>
-          <w:sz w:val="18"/>
-          <w:szCs w:val="18"/>
-        </w:rPr>
-      </w:r>
-    </w:p>
-    <w:p>
-      <w:pPr>
-        <w:pStyle w:val="BodyText"/>
-        <w:numPr>
-          <w:ilvl w:val="0"/>
-          <w:numId w:val="5"/>
-        </w:numPr>
-        <w:tabs>
-          <w:tab w:val="left" w:pos="709" w:leader="none"/>
-        </w:tabs>
-        <w:bidi w:val="0"/>
-        <w:spacing w:lineRule="auto" w:line="240" w:before="0" w:after="0"/>
-        <w:ind w:hanging="283" w:start="709"/>
-        <w:jc w:val="start"/>
-        <w:rPr>
-          <w:sz w:val="18"/>
-          <w:szCs w:val="18"/>
-        </w:rPr>
-      </w:pPr>
-      <w:r>
-        <w:rPr>
-          <w:rFonts w:ascii="Segoe UI Black" w:hAnsi="Segoe UI Black"/>
-          <w:color w:val="666666"/>
-          <w:sz w:val="18"/>
-          <w:szCs w:val="18"/>
-        </w:rPr>
-        <w:t xml:space="preserve">O que é Node.js? </w:t>
+          <w:b/>
+          <w:bCs/>
+          <w:color w:val="333333"/>
+          <w:sz w:val="18"/>
+          <w:szCs w:val="18"/>
+        </w:rPr>
+      </w:pPr>
+      <w:r>
+        <w:rPr>
+          <w:rFonts w:ascii="Segoe UI Semibold" w:hAnsi="Segoe UI Semibold"/>
+          <w:b/>
+          <w:bCs/>
+          <w:color w:val="333333"/>
+          <w:sz w:val="18"/>
+          <w:szCs w:val="18"/>
+        </w:rPr>
       </w:r>
     </w:p>
     <w:p>
@@ -5789,23 +6322,41 @@
           <w:ilvl w:val="0"/>
           <w:numId w:val="0"/>
         </w:numPr>
+        <w:tabs>
+          <w:tab w:val="left" w:pos="709" w:leader="none"/>
+        </w:tabs>
         <w:bidi w:val="0"/>
         <w:spacing w:lineRule="auto" w:line="240" w:before="0" w:after="0"/>
         <w:ind w:hanging="0" w:start="0"/>
         <w:jc w:val="start"/>
         <w:rPr>
-          <w:sz w:val="18"/>
-          <w:szCs w:val="18"/>
-        </w:rPr>
-      </w:pPr>
-      <w:r>
-        <w:rPr>
-          <w:rFonts w:ascii="Segoe UI Semibold" w:hAnsi="Segoe UI Semibold"/>
-          <w:color w:val="333333"/>
-          <w:sz w:val="18"/>
-          <w:szCs w:val="18"/>
-        </w:rPr>
-        <w:t xml:space="preserve">Resposta: </w:t>
+          <w:b/>
+          <w:bCs/>
+          <w:sz w:val="18"/>
+          <w:szCs w:val="18"/>
+        </w:rPr>
+      </w:pPr>
+      <w:r>
+        <w:rPr>
+          <w:rFonts w:ascii="Segoe UI Black" w:hAnsi="Segoe UI Black"/>
+          <w:b/>
+          <w:bCs/>
+          <w:color w:val="666666"/>
+          <w:sz w:val="18"/>
+          <w:szCs w:val="18"/>
+        </w:rPr>
+        <w:t xml:space="preserve">3. </w:t>
+      </w:r>
+      <w:r>
+        <w:rPr>
+          <w:rFonts w:ascii="Segoe UI Black" w:hAnsi="Segoe UI Black"/>
+          <w:b/>
+          <w:bCs/>
+          <w:color w:val="666666"/>
+          <w:sz w:val="18"/>
+          <w:szCs w:val="18"/>
+        </w:rPr>
+        <w:t xml:space="preserve">O que é a MDN? </w:t>
       </w:r>
     </w:p>
     <w:p>
@@ -5820,48 +6371,22 @@
         <w:ind w:hanging="0" w:start="0"/>
         <w:jc w:val="start"/>
         <w:rPr>
-          <w:rFonts w:ascii="Segoe UI Semibold" w:hAnsi="Segoe UI Semibold"/>
-          <w:color w:val="333333"/>
-          <w:sz w:val="18"/>
-          <w:szCs w:val="18"/>
-        </w:rPr>
-      </w:pPr>
-      <w:r>
-        <w:rPr>
-          <w:rFonts w:ascii="Segoe UI Semibold" w:hAnsi="Segoe UI Semibold"/>
-          <w:color w:val="333333"/>
-          <w:sz w:val="18"/>
-          <w:szCs w:val="18"/>
-        </w:rPr>
-      </w:r>
-    </w:p>
-    <w:p>
-      <w:pPr>
-        <w:pStyle w:val="BodyText"/>
-        <w:numPr>
-          <w:ilvl w:val="0"/>
-          <w:numId w:val="5"/>
-        </w:numPr>
-        <w:tabs>
-          <w:tab w:val="left" w:pos="709" w:leader="none"/>
-        </w:tabs>
-        <w:bidi w:val="0"/>
-        <w:spacing w:lineRule="auto" w:line="240" w:before="0" w:after="0"/>
-        <w:ind w:hanging="283" w:start="709"/>
-        <w:jc w:val="start"/>
-        <w:rPr>
-          <w:sz w:val="18"/>
-          <w:szCs w:val="18"/>
-        </w:rPr>
-      </w:pPr>
-      <w:r>
-        <w:rPr>
-          <w:rFonts w:ascii="Segoe UI Black" w:hAnsi="Segoe UI Black"/>
-          <w:color w:val="666666"/>
-          <w:sz w:val="18"/>
-          <w:szCs w:val="18"/>
-        </w:rPr>
-        <w:t xml:space="preserve">Para que serve o Git? </w:t>
+          <w:b/>
+          <w:bCs/>
+          <w:sz w:val="18"/>
+          <w:szCs w:val="18"/>
+        </w:rPr>
+      </w:pPr>
+      <w:r>
+        <w:rPr>
+          <w:rFonts w:ascii="Segoe UI Semibold" w:hAnsi="Segoe UI Semibold"/>
+          <w:b/>
+          <w:bCs/>
+          <w:color w:val="333333"/>
+          <w:sz w:val="18"/>
+          <w:szCs w:val="18"/>
+        </w:rPr>
+        <w:t>Resposta: É um site de referência e aprendizado mantido pela Mozilla e por uma comunidade aberta. É uma das principais fontes oficiais de documentação sobre JavaScript, HTML, CSS e APIs Web.</w:t>
       </w:r>
     </w:p>
     <w:p>
@@ -5876,18 +6401,23 @@
         <w:ind w:hanging="0" w:start="0"/>
         <w:jc w:val="start"/>
         <w:rPr>
-          <w:sz w:val="18"/>
-          <w:szCs w:val="18"/>
-        </w:rPr>
-      </w:pPr>
-      <w:r>
-        <w:rPr>
-          <w:rFonts w:ascii="Segoe UI Semibold" w:hAnsi="Segoe UI Semibold"/>
-          <w:color w:val="333333"/>
-          <w:sz w:val="18"/>
-          <w:szCs w:val="18"/>
-        </w:rPr>
-        <w:t xml:space="preserve">Resposta: </w:t>
+          <w:rFonts w:ascii="Segoe UI Semibold" w:hAnsi="Segoe UI Semibold"/>
+          <w:b/>
+          <w:bCs/>
+          <w:color w:val="333333"/>
+          <w:sz w:val="18"/>
+          <w:szCs w:val="18"/>
+        </w:rPr>
+      </w:pPr>
+      <w:r>
+        <w:rPr>
+          <w:rFonts w:ascii="Segoe UI Semibold" w:hAnsi="Segoe UI Semibold"/>
+          <w:b/>
+          <w:bCs/>
+          <w:color w:val="333333"/>
+          <w:sz w:val="18"/>
+          <w:szCs w:val="18"/>
+        </w:rPr>
       </w:r>
     </w:p>
     <w:p>
@@ -5897,53 +6427,41 @@
           <w:ilvl w:val="0"/>
           <w:numId w:val="0"/>
         </w:numPr>
+        <w:tabs>
+          <w:tab w:val="left" w:pos="709" w:leader="none"/>
+        </w:tabs>
         <w:bidi w:val="0"/>
         <w:spacing w:lineRule="auto" w:line="240" w:before="0" w:after="0"/>
         <w:ind w:hanging="0" w:start="0"/>
         <w:jc w:val="start"/>
         <w:rPr>
-          <w:rFonts w:ascii="Segoe UI Semibold" w:hAnsi="Segoe UI Semibold"/>
-          <w:color w:val="333333"/>
-          <w:sz w:val="18"/>
-          <w:szCs w:val="18"/>
-        </w:rPr>
-      </w:pPr>
-      <w:r>
-        <w:rPr>
-          <w:rFonts w:ascii="Segoe UI Semibold" w:hAnsi="Segoe UI Semibold"/>
-          <w:color w:val="333333"/>
-          <w:sz w:val="18"/>
-          <w:szCs w:val="18"/>
-        </w:rPr>
-      </w:r>
-    </w:p>
-    <w:p>
-      <w:pPr>
-        <w:pStyle w:val="BodyText"/>
-        <w:numPr>
-          <w:ilvl w:val="0"/>
-          <w:numId w:val="5"/>
-        </w:numPr>
-        <w:tabs>
-          <w:tab w:val="left" w:pos="709" w:leader="none"/>
-        </w:tabs>
-        <w:bidi w:val="0"/>
-        <w:spacing w:lineRule="auto" w:line="240" w:before="0" w:after="0"/>
-        <w:ind w:hanging="283" w:start="709"/>
-        <w:jc w:val="start"/>
-        <w:rPr>
-          <w:sz w:val="18"/>
-          <w:szCs w:val="18"/>
-        </w:rPr>
-      </w:pPr>
-      <w:r>
-        <w:rPr>
-          <w:rFonts w:ascii="Segoe UI Black" w:hAnsi="Segoe UI Black"/>
-          <w:color w:val="666666"/>
-          <w:sz w:val="18"/>
-          <w:szCs w:val="18"/>
-        </w:rPr>
-        <w:t xml:space="preserve">Para que serve o GitHub? </w:t>
+          <w:b/>
+          <w:bCs/>
+          <w:sz w:val="18"/>
+          <w:szCs w:val="18"/>
+        </w:rPr>
+      </w:pPr>
+      <w:r>
+        <w:rPr>
+          <w:rFonts w:ascii="Segoe UI Black" w:hAnsi="Segoe UI Black"/>
+          <w:b/>
+          <w:bCs/>
+          <w:color w:val="666666"/>
+          <w:sz w:val="18"/>
+          <w:szCs w:val="18"/>
+        </w:rPr>
+        <w:t xml:space="preserve">4. </w:t>
+      </w:r>
+      <w:r>
+        <w:rPr>
+          <w:rFonts w:ascii="Segoe UI Black" w:hAnsi="Segoe UI Black"/>
+          <w:b/>
+          <w:bCs/>
+          <w:color w:val="666666"/>
+          <w:sz w:val="18"/>
+          <w:szCs w:val="18"/>
+        </w:rPr>
+        <w:t xml:space="preserve">O que é Node.js? </w:t>
       </w:r>
     </w:p>
     <w:p>
@@ -5958,18 +6476,228 @@
         <w:ind w:hanging="0" w:start="0"/>
         <w:jc w:val="start"/>
         <w:rPr>
-          <w:sz w:val="18"/>
-          <w:szCs w:val="18"/>
-        </w:rPr>
-      </w:pPr>
-      <w:r>
-        <w:rPr>
-          <w:rFonts w:ascii="Segoe UI Semibold" w:hAnsi="Segoe UI Semibold"/>
-          <w:color w:val="333333"/>
-          <w:sz w:val="18"/>
-          <w:szCs w:val="18"/>
-        </w:rPr>
-        <w:t xml:space="preserve">Resposta: </w:t>
+          <w:b/>
+          <w:bCs/>
+          <w:sz w:val="18"/>
+          <w:szCs w:val="18"/>
+        </w:rPr>
+      </w:pPr>
+      <w:r>
+        <w:rPr>
+          <w:rFonts w:ascii="Segoe UI Semibold" w:hAnsi="Segoe UI Semibold"/>
+          <w:b/>
+          <w:bCs/>
+          <w:color w:val="333333"/>
+          <w:sz w:val="18"/>
+          <w:szCs w:val="18"/>
+        </w:rPr>
+        <w:t>Resposta: Node.js é um ambiente de execução que permite executar código JavaScript fora do navegador, principalmente no lado do servidor. Ele utiliza o motor V8 do Google Chrome.</w:t>
+      </w:r>
+    </w:p>
+    <w:p>
+      <w:pPr>
+        <w:pStyle w:val="BodyText"/>
+        <w:numPr>
+          <w:ilvl w:val="0"/>
+          <w:numId w:val="0"/>
+        </w:numPr>
+        <w:bidi w:val="0"/>
+        <w:spacing w:lineRule="auto" w:line="240" w:before="0" w:after="0"/>
+        <w:ind w:hanging="0" w:start="0"/>
+        <w:jc w:val="start"/>
+        <w:rPr>
+          <w:rFonts w:ascii="Segoe UI Semibold" w:hAnsi="Segoe UI Semibold"/>
+          <w:b/>
+          <w:bCs/>
+          <w:color w:val="333333"/>
+          <w:sz w:val="18"/>
+          <w:szCs w:val="18"/>
+        </w:rPr>
+      </w:pPr>
+      <w:r>
+        <w:rPr>
+          <w:rFonts w:ascii="Segoe UI Semibold" w:hAnsi="Segoe UI Semibold"/>
+          <w:b/>
+          <w:bCs/>
+          <w:color w:val="333333"/>
+          <w:sz w:val="18"/>
+          <w:szCs w:val="18"/>
+        </w:rPr>
+      </w:r>
+    </w:p>
+    <w:p>
+      <w:pPr>
+        <w:pStyle w:val="BodyText"/>
+        <w:numPr>
+          <w:ilvl w:val="0"/>
+          <w:numId w:val="0"/>
+        </w:numPr>
+        <w:tabs>
+          <w:tab w:val="left" w:pos="709" w:leader="none"/>
+        </w:tabs>
+        <w:bidi w:val="0"/>
+        <w:spacing w:lineRule="auto" w:line="240" w:before="0" w:after="0"/>
+        <w:ind w:hanging="0" w:start="0"/>
+        <w:jc w:val="start"/>
+        <w:rPr>
+          <w:b/>
+          <w:bCs/>
+          <w:sz w:val="18"/>
+          <w:szCs w:val="18"/>
+        </w:rPr>
+      </w:pPr>
+      <w:r>
+        <w:rPr>
+          <w:rFonts w:ascii="Segoe UI Black" w:hAnsi="Segoe UI Black"/>
+          <w:b/>
+          <w:bCs/>
+          <w:color w:val="666666"/>
+          <w:sz w:val="18"/>
+          <w:szCs w:val="18"/>
+        </w:rPr>
+        <w:t xml:space="preserve">5. </w:t>
+      </w:r>
+      <w:r>
+        <w:rPr>
+          <w:rFonts w:ascii="Segoe UI Black" w:hAnsi="Segoe UI Black"/>
+          <w:b/>
+          <w:bCs/>
+          <w:color w:val="666666"/>
+          <w:sz w:val="18"/>
+          <w:szCs w:val="18"/>
+        </w:rPr>
+        <w:t xml:space="preserve">Para que serve o Git? </w:t>
+      </w:r>
+    </w:p>
+    <w:p>
+      <w:pPr>
+        <w:pStyle w:val="BodyText"/>
+        <w:numPr>
+          <w:ilvl w:val="0"/>
+          <w:numId w:val="0"/>
+        </w:numPr>
+        <w:bidi w:val="0"/>
+        <w:spacing w:lineRule="auto" w:line="240" w:before="0" w:after="0"/>
+        <w:ind w:hanging="0" w:start="0"/>
+        <w:jc w:val="start"/>
+        <w:rPr>
+          <w:b/>
+          <w:bCs/>
+          <w:sz w:val="18"/>
+          <w:szCs w:val="18"/>
+        </w:rPr>
+      </w:pPr>
+      <w:r>
+        <w:rPr>
+          <w:rFonts w:ascii="Segoe UI Semibold" w:hAnsi="Segoe UI Semibold"/>
+          <w:b/>
+          <w:bCs/>
+          <w:color w:val="333333"/>
+          <w:sz w:val="18"/>
+          <w:szCs w:val="18"/>
+        </w:rPr>
+        <w:t>Resposta:  Git é um sistema de controle de versão distribuído que permite registrar alterações no código, colaborar com outros desenvolvedores e recuperar versões anteriores de um projeto.</w:t>
+      </w:r>
+    </w:p>
+    <w:p>
+      <w:pPr>
+        <w:pStyle w:val="BodyText"/>
+        <w:numPr>
+          <w:ilvl w:val="0"/>
+          <w:numId w:val="0"/>
+        </w:numPr>
+        <w:bidi w:val="0"/>
+        <w:spacing w:lineRule="auto" w:line="240" w:before="0" w:after="0"/>
+        <w:ind w:hanging="0" w:start="0"/>
+        <w:jc w:val="start"/>
+        <w:rPr>
+          <w:rFonts w:ascii="Segoe UI Semibold" w:hAnsi="Segoe UI Semibold"/>
+          <w:b/>
+          <w:bCs/>
+          <w:color w:val="333333"/>
+          <w:sz w:val="18"/>
+          <w:szCs w:val="18"/>
+        </w:rPr>
+      </w:pPr>
+      <w:r>
+        <w:rPr>
+          <w:rFonts w:ascii="Segoe UI Semibold" w:hAnsi="Segoe UI Semibold"/>
+          <w:b/>
+          <w:bCs/>
+          <w:color w:val="333333"/>
+          <w:sz w:val="18"/>
+          <w:szCs w:val="18"/>
+        </w:rPr>
+      </w:r>
+    </w:p>
+    <w:p>
+      <w:pPr>
+        <w:pStyle w:val="BodyText"/>
+        <w:numPr>
+          <w:ilvl w:val="0"/>
+          <w:numId w:val="0"/>
+        </w:numPr>
+        <w:tabs>
+          <w:tab w:val="left" w:pos="709" w:leader="none"/>
+        </w:tabs>
+        <w:bidi w:val="0"/>
+        <w:spacing w:lineRule="auto" w:line="240" w:before="0" w:after="0"/>
+        <w:ind w:hanging="0" w:start="0"/>
+        <w:jc w:val="start"/>
+        <w:rPr>
+          <w:b/>
+          <w:bCs/>
+          <w:sz w:val="18"/>
+          <w:szCs w:val="18"/>
+        </w:rPr>
+      </w:pPr>
+      <w:r>
+        <w:rPr>
+          <w:rFonts w:ascii="Segoe UI Black" w:hAnsi="Segoe UI Black"/>
+          <w:b/>
+          <w:bCs/>
+          <w:color w:val="666666"/>
+          <w:sz w:val="18"/>
+          <w:szCs w:val="18"/>
+        </w:rPr>
+        <w:t xml:space="preserve">6. </w:t>
+      </w:r>
+      <w:r>
+        <w:rPr>
+          <w:rFonts w:ascii="Segoe UI Black" w:hAnsi="Segoe UI Black"/>
+          <w:b/>
+          <w:bCs/>
+          <w:color w:val="666666"/>
+          <w:sz w:val="18"/>
+          <w:szCs w:val="18"/>
+        </w:rPr>
+        <w:t xml:space="preserve">Para que serve o GitHub? </w:t>
+      </w:r>
+    </w:p>
+    <w:p>
+      <w:pPr>
+        <w:pStyle w:val="BodyText"/>
+        <w:numPr>
+          <w:ilvl w:val="0"/>
+          <w:numId w:val="0"/>
+        </w:numPr>
+        <w:bidi w:val="0"/>
+        <w:spacing w:lineRule="auto" w:line="240" w:before="0" w:after="0"/>
+        <w:ind w:hanging="0" w:start="0"/>
+        <w:jc w:val="start"/>
+        <w:rPr>
+          <w:sz w:val="18"/>
+          <w:szCs w:val="18"/>
+        </w:rPr>
+      </w:pPr>
+      <w:r>
+        <w:rPr>
+          <w:rFonts w:ascii="Segoe UI Semibold" w:hAnsi="Segoe UI Semibold"/>
+          <w:color w:val="333333"/>
+          <w:sz w:val="18"/>
+          <w:szCs w:val="18"/>
+        </w:rPr>
+        <w:t>Resposta: GitHub é uma plataforma baseada em nuvem para hospedar repositórios Git, permitindo armazenar projetos, colaborar em equipe, revisar código, controlar versões e automatizar processos de desenvolvimento.</w:t>
       </w:r>
     </w:p>
     <w:p>
@@ -7476,6 +8204,16 @@
       <w:szCs w:val="20"/>
     </w:rPr>
   </w:style>
+  <w:style w:type="paragraph" w:styleId="Blocodecitaouser">
+    <w:name w:val="Bloco de citação (user)"/>
+    <w:basedOn w:val="Normal"/>
+    <w:qFormat/>
+    <w:pPr>
+      <w:spacing w:before="0" w:after="283"/>
+      <w:ind w:hanging="0" w:start="567" w:end="567"/>
+    </w:pPr>
+    <w:rPr/>
+  </w:style>
 </w:styles>
 </file>
 

</xml_diff>